<commit_message>
Users' Guide: System Settings tabs, color schemes and logos, Financial Settings and the Financial Admin role, lifetime members
Co-Authored-By: Claude Opus 5.5 <noreply@anthropic.com>
</commit_message>
<xml_diff>
--- a/docs/users-guide/Honcho_Users_Guide.docx
+++ b/docs/users-guide/Honcho_Users_Guide.docx
@@ -940,7 +940,7 @@
                 <w:sz w:val="19"/>
                 <w:szCs w:val="19"/>
               </w:rPr>
-              <w:t xml:space="preserve">Document Library user or admin</w:t>
+              <w:t xml:space="preserve">Financial Admin</w:t>
             </w:r>
           </w:p>
         </w:tc>
@@ -965,7 +965,7 @@
                 <w:sz w:val="19"/>
                 <w:szCs w:val="19"/>
               </w:rPr>
-              <w:t xml:space="preserve">Members and staff given library access</w:t>
+              <w:t xml:space="preserve">The Treasurer, and anyone else they choose</w:t>
             </w:r>
           </w:p>
         </w:tc>
@@ -990,7 +990,7 @@
                 <w:sz w:val="19"/>
                 <w:szCs w:val="19"/>
               </w:rPr>
-              <w:t xml:space="preserve">Find, add, review and approve documents</w:t>
+              <w:t xml:space="preserve">Financial Settings: the current membership year, the grace period, the dues payment year and new-member dues</w:t>
             </w:r>
           </w:p>
         </w:tc>
@@ -1015,7 +1015,7 @@
                 <w:sz w:val="19"/>
                 <w:szCs w:val="19"/>
               </w:rPr>
-              <w:t xml:space="preserve">6</w:t>
+              <w:t xml:space="preserve">8</w:t>
             </w:r>
           </w:p>
         </w:tc>
@@ -1044,7 +1044,7 @@
                 <w:sz w:val="19"/>
                 <w:szCs w:val="19"/>
               </w:rPr>
-              <w:t xml:space="preserve">Projects user or admin</w:t>
+              <w:t xml:space="preserve">Document Library user or admin</w:t>
             </w:r>
           </w:p>
         </w:tc>
@@ -1069,7 +1069,7 @@
                 <w:sz w:val="19"/>
                 <w:szCs w:val="19"/>
               </w:rPr>
-              <w:t xml:space="preserve">Staff and members on project teams (add-on)</w:t>
+              <w:t xml:space="preserve">Members and staff given library access</w:t>
             </w:r>
           </w:p>
         </w:tc>
@@ -1094,7 +1094,7 @@
                 <w:sz w:val="19"/>
                 <w:szCs w:val="19"/>
               </w:rPr>
-              <w:t xml:space="preserve">Teams and projects</w:t>
+              <w:t xml:space="preserve">Find, add, review and approve documents</w:t>
             </w:r>
           </w:p>
         </w:tc>
@@ -1119,7 +1119,7 @@
                 <w:sz w:val="19"/>
                 <w:szCs w:val="19"/>
               </w:rPr>
-              <w:t xml:space="preserve">7</w:t>
+              <w:t xml:space="preserve">6</w:t>
             </w:r>
           </w:p>
         </w:tc>
@@ -1148,7 +1148,7 @@
                 <w:sz w:val="19"/>
                 <w:szCs w:val="19"/>
               </w:rPr>
-              <w:t xml:space="preserve">System Admin</w:t>
+              <w:t xml:space="preserve">Projects user or admin</w:t>
             </w:r>
           </w:p>
         </w:tc>
@@ -1173,7 +1173,7 @@
                 <w:sz w:val="19"/>
                 <w:szCs w:val="19"/>
               </w:rPr>
-              <w:t xml:space="preserve">A few trusted people</w:t>
+              <w:t xml:space="preserve">Staff and members on project teams (add-on)</w:t>
             </w:r>
           </w:p>
         </w:tc>
@@ -1198,7 +1198,7 @@
                 <w:sz w:val="19"/>
                 <w:szCs w:val="19"/>
               </w:rPr>
-              <w:t xml:space="preserve">Member permissions, chapters, settings and audit log (see Chapter 8), everything above</w:t>
+              <w:t xml:space="preserve">Teams and projects</w:t>
             </w:r>
           </w:p>
         </w:tc>
@@ -1223,7 +1223,7 @@
                 <w:sz w:val="19"/>
                 <w:szCs w:val="19"/>
               </w:rPr>
-              <w:t xml:space="preserve">8</w:t>
+              <w:t xml:space="preserve">7</w:t>
             </w:r>
           </w:p>
         </w:tc>
@@ -1252,7 +1252,7 @@
                 <w:sz w:val="19"/>
                 <w:szCs w:val="19"/>
               </w:rPr>
-              <w:t xml:space="preserve">Staff</w:t>
+              <w:t xml:space="preserve">System Admin</w:t>
             </w:r>
           </w:p>
         </w:tc>
@@ -1277,7 +1277,7 @@
                 <w:sz w:val="19"/>
                 <w:szCs w:val="19"/>
               </w:rPr>
-              <w:t xml:space="preserve">Employees using the separate staff login</w:t>
+              <w:t xml:space="preserve">A few trusted people</w:t>
             </w:r>
           </w:p>
         </w:tc>
@@ -1302,7 +1302,7 @@
                 <w:sz w:val="19"/>
                 <w:szCs w:val="19"/>
               </w:rPr>
-              <w:t xml:space="preserve">The Honcho staff portal</w:t>
+              <w:t xml:space="preserve">Member permissions, chapters, System Settings (names, wording, colors, logos, website switches, financial settings) and the audit log, everything above</w:t>
             </w:r>
           </w:p>
         </w:tc>
@@ -1310,6 +1310,110 @@
           <w:tcPr>
             <w:tcW w:type="dxa" w:w="2340"/>
             <w:shd w:fill="F7F9FA" w:val="clear"/>
+            <w:tcMar>
+              <w:top w:type="dxa" w:w="100"/>
+              <w:left w:type="dxa" w:w="120"/>
+              <w:bottom w:type="dxa" w:w="100"/>
+              <w:right w:type="dxa" w:w="120"/>
+            </w:tcMar>
+          </w:tcPr>
+          <w:p>
+            <w:pPr>
+              <w:spacing w:after="0"/>
+            </w:pPr>
+            <w:r>
+              <w:rPr>
+                <w:rFonts w:ascii="Calibri" w:cs="Calibri" w:eastAsia="Calibri" w:hAnsi="Calibri"/>
+                <w:sz w:val="19"/>
+                <w:szCs w:val="19"/>
+              </w:rPr>
+              <w:t xml:space="preserve">8</w:t>
+            </w:r>
+          </w:p>
+        </w:tc>
+      </w:tr>
+      <w:tr>
+        <w:tc>
+          <w:tcPr>
+            <w:tcW w:type="dxa" w:w="2340"/>
+            <w:shd w:fill="FFFFFF" w:val="clear"/>
+            <w:tcMar>
+              <w:top w:type="dxa" w:w="100"/>
+              <w:left w:type="dxa" w:w="120"/>
+              <w:bottom w:type="dxa" w:w="100"/>
+              <w:right w:type="dxa" w:w="120"/>
+            </w:tcMar>
+          </w:tcPr>
+          <w:p>
+            <w:pPr>
+              <w:spacing w:after="0"/>
+            </w:pPr>
+            <w:r>
+              <w:rPr>
+                <w:rFonts w:ascii="Calibri" w:cs="Calibri" w:eastAsia="Calibri" w:hAnsi="Calibri"/>
+                <w:b/>
+                <w:bCs/>
+                <w:sz w:val="19"/>
+                <w:szCs w:val="19"/>
+              </w:rPr>
+              <w:t xml:space="preserve">Staff</w:t>
+            </w:r>
+          </w:p>
+        </w:tc>
+        <w:tc>
+          <w:tcPr>
+            <w:tcW w:type="dxa" w:w="2340"/>
+            <w:shd w:fill="FFFFFF" w:val="clear"/>
+            <w:tcMar>
+              <w:top w:type="dxa" w:w="100"/>
+              <w:left w:type="dxa" w:w="120"/>
+              <w:bottom w:type="dxa" w:w="100"/>
+              <w:right w:type="dxa" w:w="120"/>
+            </w:tcMar>
+          </w:tcPr>
+          <w:p>
+            <w:pPr>
+              <w:spacing w:after="0"/>
+            </w:pPr>
+            <w:r>
+              <w:rPr>
+                <w:rFonts w:ascii="Calibri" w:cs="Calibri" w:eastAsia="Calibri" w:hAnsi="Calibri"/>
+                <w:sz w:val="19"/>
+                <w:szCs w:val="19"/>
+              </w:rPr>
+              <w:t xml:space="preserve">Employees using the separate staff login</w:t>
+            </w:r>
+          </w:p>
+        </w:tc>
+        <w:tc>
+          <w:tcPr>
+            <w:tcW w:type="dxa" w:w="2340"/>
+            <w:shd w:fill="FFFFFF" w:val="clear"/>
+            <w:tcMar>
+              <w:top w:type="dxa" w:w="100"/>
+              <w:left w:type="dxa" w:w="120"/>
+              <w:bottom w:type="dxa" w:w="100"/>
+              <w:right w:type="dxa" w:w="120"/>
+            </w:tcMar>
+          </w:tcPr>
+          <w:p>
+            <w:pPr>
+              <w:spacing w:after="0"/>
+            </w:pPr>
+            <w:r>
+              <w:rPr>
+                <w:rFonts w:ascii="Calibri" w:cs="Calibri" w:eastAsia="Calibri" w:hAnsi="Calibri"/>
+                <w:sz w:val="19"/>
+                <w:szCs w:val="19"/>
+              </w:rPr>
+              <w:t xml:space="preserve">The Honcho staff portal</w:t>
+            </w:r>
+          </w:p>
+        </w:tc>
+        <w:tc>
+          <w:tcPr>
+            <w:tcW w:type="dxa" w:w="2340"/>
+            <w:shd w:fill="FFFFFF" w:val="clear"/>
             <w:tcMar>
               <w:top w:type="dxa" w:w="100"/>
               <w:left w:type="dxa" w:w="120"/>
@@ -4180,6 +4284,39 @@
       <w:r>
         <w:rPr>
           <w:rFonts w:ascii="Calibri" w:cs="Calibri" w:eastAsia="Calibri" w:hAnsi="Calibri"/>
+          <w:b/>
+          <w:bCs/>
+        </w:rPr>
+        <w:t xml:space="preserve">Lifetime members</w:t>
+      </w:r>
+      <w:r>
+        <w:rPr>
+          <w:rFonts w:ascii="Calibri" w:cs="Calibri" w:eastAsia="Calibri" w:hAnsi="Calibri"/>
+        </w:rPr>
+        <w:t xml:space="preserve"> have the year </w:t>
+      </w:r>
+      <w:r>
+        <w:rPr>
+          <w:rFonts w:ascii="Calibri" w:cs="Calibri" w:eastAsia="Calibri" w:hAnsi="Calibri"/>
+          <w:b/>
+          <w:bCs/>
+        </w:rPr>
+        <w:t xml:space="preserve">2099</w:t>
+      </w:r>
+      <w:r>
+        <w:rPr>
+          <w:rFonts w:ascii="Calibri" w:cs="Calibri" w:eastAsia="Calibri" w:hAnsi="Calibri"/>
+        </w:rPr>
+        <w:t xml:space="preserve"> on their Membership tab and are always Current.</w:t>
+      </w:r>
+    </w:p>
+    <w:p>
+      <w:pPr>
+        <w:spacing w:after="160"/>
+      </w:pPr>
+      <w:r>
+        <w:rPr>
+          <w:rFonts w:ascii="Calibri" w:cs="Calibri" w:eastAsia="Calibri" w:hAnsi="Calibri"/>
         </w:rPr>
         <w:t xml:space="preserve">If your status looks wrong after paying, contact your Chapter Admin or the membership officer.</w:t>
       </w:r>
@@ -8319,7 +8456,46 @@
         <w:rPr>
           <w:rFonts w:ascii="Calibri" w:cs="Calibri" w:eastAsia="Calibri" w:hAnsi="Calibri"/>
         </w:rPr>
-        <w:t xml:space="preserve"> bulk action on members who have paid.</w:t>
+        <w:t xml:space="preserve"> bulk action on members who have paid. The current year itself and the grace period are set by a Financial Admin or System Admin (Financial Settings, Chapter 8).</w:t>
+      </w:r>
+    </w:p>
+    <w:p>
+      <w:pPr>
+        <w:spacing w:after="160"/>
+      </w:pPr>
+      <w:r>
+        <w:rPr>
+          <w:rFonts w:ascii="Calibri" w:cs="Calibri" w:eastAsia="Calibri" w:hAnsi="Calibri"/>
+        </w:rPr>
+        <w:t xml:space="preserve">To make someone a </w:t>
+      </w:r>
+      <w:r>
+        <w:rPr>
+          <w:rFonts w:ascii="Calibri" w:cs="Calibri" w:eastAsia="Calibri" w:hAnsi="Calibri"/>
+          <w:b/>
+          <w:bCs/>
+        </w:rPr>
+        <w:t xml:space="preserve">lifetime member</w:t>
+      </w:r>
+      <w:r>
+        <w:rPr>
+          <w:rFonts w:ascii="Calibri" w:cs="Calibri" w:eastAsia="Calibri" w:hAnsi="Calibri"/>
+        </w:rPr>
+        <w:t xml:space="preserve">, enter </w:t>
+      </w:r>
+      <w:r>
+        <w:rPr>
+          <w:rFonts w:ascii="Calibri" w:cs="Calibri" w:eastAsia="Calibri" w:hAnsi="Calibri"/>
+          <w:b/>
+          <w:bCs/>
+        </w:rPr>
+        <w:t xml:space="preserve">2099</w:t>
+      </w:r>
+      <w:r>
+        <w:rPr>
+          <w:rFonts w:ascii="Calibri" w:cs="Calibri" w:eastAsia="Calibri" w:hAnsi="Calibri"/>
+        </w:rPr>
+        <w:t xml:space="preserve"> as their Current Year and save. Lifetime members are always Current, whatever the dues year.</w:t>
       </w:r>
     </w:p>
     <w:p>
@@ -8367,7 +8543,7 @@
         <w:rPr>
           <w:rFonts w:ascii="Calibri" w:cs="Calibri" w:eastAsia="Calibri" w:hAnsi="Calibri"/>
         </w:rPr>
-        <w:t xml:space="preserve">, tick the roles they should have (for example Chapter Admin or Content Admin) and save. They see the new menus the next time they log in. System, Member, Chapter and Student Admin are kept in Security Groups, so the change also shows there. System Admins can also set everyone's roles from one list: </w:t>
+        <w:t xml:space="preserve">, tick the roles they should have (for example Chapter Admin or Content Admin) and save. They see the new menus the next time they log in. System, Member, Chapter, Student, Content, Event and Financial Admin are kept in Security Groups, so the change also shows there. System Admins can also set everyone's roles from one list: </w:t>
       </w:r>
       <w:r>
         <w:rPr>
@@ -12719,7 +12895,7 @@
                 <w:sz w:val="19"/>
                 <w:szCs w:val="19"/>
               </w:rPr>
-              <w:t xml:space="preserve">Every member's admin roles in one list (System, Member, Chapter, Student, Content and Event Admin). Click a box to give or remove a role</w:t>
+              <w:t xml:space="preserve">Every member's admin roles in one list (System, Member, Chapter, Student, Content, Event and Financial Admin). Click a box to give or remove a role</w:t>
             </w:r>
           </w:p>
         </w:tc>
@@ -12773,7 +12949,7 @@
                 <w:sz w:val="19"/>
                 <w:szCs w:val="19"/>
               </w:rPr>
-              <w:t xml:space="preserve">Values that change how the system behaves, such as the current membership year, whether the Document Library shows its first and last kanban columns, and the colors and labels used across the site. Only on installs without the staff portal (see below)</w:t>
+              <w:t xml:space="preserve">How the system is set up for your organization, in tabs: Financial, Organization, Wording, Look, Features &amp; Policy and Document Library. See the next section. Only on installs without the staff portal (see below)</w:t>
             </w:r>
           </w:p>
         </w:tc>
@@ -13324,7 +13500,7 @@
               <w:rPr>
                 <w:rFonts w:ascii="Calibri" w:cs="Calibri" w:eastAsia="Calibri" w:hAnsi="Calibri"/>
               </w:rPr>
-              <w:t xml:space="preserve">Changes to System Settings take effect for everyone straight away. Note the old value before changing one.</w:t>
+              <w:t xml:space="preserve">Changes to System Settings take effect for everyone straight away. Note the old value before changing one. Every change is recorded in the Auditlog with its old and new value.</w:t>
             </w:r>
           </w:p>
         </w:tc>
@@ -13561,6 +13737,1167 @@
           <w:rFonts w:ascii="Calibri" w:cs="Calibri" w:eastAsia="Calibri" w:hAnsi="Calibri"/>
         </w:rPr>
         <w:t xml:space="preserve">Each entry shows the date and time (UTC), the person, the action and the record it touched. Use the search box to find all changes to one member or one document. The eye button opens one entry; the trash button deletes it (the deletion is itself logged).</w:t>
+      </w:r>
+    </w:p>
+    <w:p>
+      <w:pPr>
+        <w:pStyle w:val="Heading2"/>
+        <w:pBdr>
+          <w:bottom w:val="single" w:color="2C3E50" w:sz="6" w:space="8"/>
+        </w:pBdr>
+        <w:spacing w:after="240" w:before="500"/>
+      </w:pPr>
+      <w:r>
+        <w:t xml:space="preserve">System Settings</w:t>
+      </w:r>
+    </w:p>
+    <w:p>
+      <w:pPr>
+        <w:spacing w:after="160"/>
+      </w:pPr>
+      <w:r>
+        <w:rPr>
+          <w:rFonts w:ascii="Calibri" w:cs="Calibri" w:eastAsia="Calibri" w:hAnsi="Calibri"/>
+          <w:b/>
+          <w:bCs/>
+        </w:rPr>
+        <w:t xml:space="preserve">System Admin &gt; System Settings</w:t>
+      </w:r>
+      <w:r>
+        <w:rPr>
+          <w:rFonts w:ascii="Calibri" w:cs="Calibri" w:eastAsia="Calibri" w:hAnsi="Calibri"/>
+        </w:rPr>
+        <w:t xml:space="preserve"> has one tab per kind of setting. Change the values on a tab and click </w:t>
+      </w:r>
+      <w:r>
+        <w:rPr>
+          <w:rFonts w:ascii="Calibri" w:cs="Calibri" w:eastAsia="Calibri" w:hAnsi="Calibri"/>
+          <w:b/>
+          <w:bCs/>
+        </w:rPr>
+        <w:t xml:space="preserve">Save Changes</w:t>
+      </w:r>
+      <w:r>
+        <w:rPr>
+          <w:rFonts w:ascii="Calibri" w:cs="Calibri" w:eastAsia="Calibri" w:hAnsi="Calibri"/>
+        </w:rPr>
+        <w:t xml:space="preserve">. Each setting has a line underneath saying what it does. If a value isn't allowed (for example a web address that doesn't start with https://), nothing is saved and the message at the top says what to fix.</w:t>
+      </w:r>
+    </w:p>
+    <w:tbl>
+      <w:tblPr>
+        <w:tblW w:type="dxa" w:w="9360"/>
+        <w:tblBorders>
+          <w:top w:val="single" w:color="auto" w:sz="4"/>
+          <w:left w:val="single" w:color="auto" w:sz="4"/>
+          <w:bottom w:val="single" w:color="auto" w:sz="4"/>
+          <w:right w:val="single" w:color="auto" w:sz="4"/>
+          <w:insideH w:val="single" w:color="auto" w:sz="4"/>
+          <w:insideV w:val="single" w:color="auto" w:sz="4"/>
+        </w:tblBorders>
+      </w:tblPr>
+      <w:tblGrid>
+        <w:gridCol w:w="4680"/>
+        <w:gridCol w:w="4680"/>
+      </w:tblGrid>
+      <w:tr>
+        <w:trPr>
+          <w:tblHeader/>
+        </w:trPr>
+        <w:tc>
+          <w:tcPr>
+            <w:tcW w:type="dxa" w:w="4680"/>
+            <w:shd w:fill="2C3E50" w:val="clear"/>
+            <w:tcMar>
+              <w:top w:type="dxa" w:w="100"/>
+              <w:left w:type="dxa" w:w="120"/>
+              <w:bottom w:type="dxa" w:w="100"/>
+              <w:right w:type="dxa" w:w="120"/>
+            </w:tcMar>
+          </w:tcPr>
+          <w:p>
+            <w:pPr>
+              <w:spacing w:after="0"/>
+            </w:pPr>
+            <w:r>
+              <w:rPr>
+                <w:rFonts w:ascii="Calibri" w:cs="Calibri" w:eastAsia="Calibri" w:hAnsi="Calibri"/>
+                <w:b/>
+                <w:bCs/>
+                <w:color w:val="FFFFFF"/>
+                <w:sz w:val="20"/>
+                <w:szCs w:val="20"/>
+              </w:rPr>
+              <w:t xml:space="preserve">Tab</w:t>
+            </w:r>
+          </w:p>
+        </w:tc>
+        <w:tc>
+          <w:tcPr>
+            <w:tcW w:type="dxa" w:w="4680"/>
+            <w:shd w:fill="2C3E50" w:val="clear"/>
+            <w:tcMar>
+              <w:top w:type="dxa" w:w="100"/>
+              <w:left w:type="dxa" w:w="120"/>
+              <w:bottom w:type="dxa" w:w="100"/>
+              <w:right w:type="dxa" w:w="120"/>
+            </w:tcMar>
+          </w:tcPr>
+          <w:p>
+            <w:pPr>
+              <w:spacing w:after="0"/>
+            </w:pPr>
+            <w:r>
+              <w:rPr>
+                <w:rFonts w:ascii="Calibri" w:cs="Calibri" w:eastAsia="Calibri" w:hAnsi="Calibri"/>
+                <w:b/>
+                <w:bCs/>
+                <w:color w:val="FFFFFF"/>
+                <w:sz w:val="20"/>
+                <w:szCs w:val="20"/>
+              </w:rPr>
+              <w:t xml:space="preserve">What it holds</w:t>
+            </w:r>
+          </w:p>
+        </w:tc>
+      </w:tr>
+      <w:tr>
+        <w:tc>
+          <w:tcPr>
+            <w:tcW w:type="dxa" w:w="4680"/>
+            <w:shd w:fill="FFFFFF" w:val="clear"/>
+            <w:tcMar>
+              <w:top w:type="dxa" w:w="100"/>
+              <w:left w:type="dxa" w:w="120"/>
+              <w:bottom w:type="dxa" w:w="100"/>
+              <w:right w:type="dxa" w:w="120"/>
+            </w:tcMar>
+          </w:tcPr>
+          <w:p>
+            <w:pPr>
+              <w:spacing w:after="0"/>
+            </w:pPr>
+            <w:r>
+              <w:rPr>
+                <w:rFonts w:ascii="Calibri" w:cs="Calibri" w:eastAsia="Calibri" w:hAnsi="Calibri"/>
+                <w:b/>
+                <w:bCs/>
+                <w:sz w:val="19"/>
+                <w:szCs w:val="19"/>
+              </w:rPr>
+              <w:t xml:space="preserve">Financial</w:t>
+            </w:r>
+          </w:p>
+        </w:tc>
+        <w:tc>
+          <w:tcPr>
+            <w:tcW w:type="dxa" w:w="4680"/>
+            <w:shd w:fill="FFFFFF" w:val="clear"/>
+            <w:tcMar>
+              <w:top w:type="dxa" w:w="100"/>
+              <w:left w:type="dxa" w:w="120"/>
+              <w:bottom w:type="dxa" w:w="100"/>
+              <w:right w:type="dxa" w:w="120"/>
+            </w:tcMar>
+          </w:tcPr>
+          <w:p>
+            <w:pPr>
+              <w:spacing w:after="0"/>
+            </w:pPr>
+            <w:r>
+              <w:rPr>
+                <w:rFonts w:ascii="Calibri" w:cs="Calibri" w:eastAsia="Calibri" w:hAnsi="Calibri"/>
+                <w:sz w:val="19"/>
+                <w:szCs w:val="19"/>
+              </w:rPr>
+              <w:t xml:space="preserve">Current membership year, grace period, dues payment year, new member dues proration. See Financial Settings below</w:t>
+            </w:r>
+          </w:p>
+        </w:tc>
+      </w:tr>
+      <w:tr>
+        <w:tc>
+          <w:tcPr>
+            <w:tcW w:type="dxa" w:w="4680"/>
+            <w:shd w:fill="F7F9FA" w:val="clear"/>
+            <w:tcMar>
+              <w:top w:type="dxa" w:w="100"/>
+              <w:left w:type="dxa" w:w="120"/>
+              <w:bottom w:type="dxa" w:w="100"/>
+              <w:right w:type="dxa" w:w="120"/>
+            </w:tcMar>
+          </w:tcPr>
+          <w:p>
+            <w:pPr>
+              <w:spacing w:after="0"/>
+            </w:pPr>
+            <w:r>
+              <w:rPr>
+                <w:rFonts w:ascii="Calibri" w:cs="Calibri" w:eastAsia="Calibri" w:hAnsi="Calibri"/>
+                <w:b/>
+                <w:bCs/>
+                <w:sz w:val="19"/>
+                <w:szCs w:val="19"/>
+              </w:rPr>
+              <w:t xml:space="preserve">Organization</w:t>
+            </w:r>
+          </w:p>
+        </w:tc>
+        <w:tc>
+          <w:tcPr>
+            <w:tcW w:type="dxa" w:w="4680"/>
+            <w:shd w:fill="F7F9FA" w:val="clear"/>
+            <w:tcMar>
+              <w:top w:type="dxa" w:w="100"/>
+              <w:left w:type="dxa" w:w="120"/>
+              <w:bottom w:type="dxa" w:w="100"/>
+              <w:right w:type="dxa" w:w="120"/>
+            </w:tcMar>
+          </w:tcPr>
+          <w:p>
+            <w:pPr>
+              <w:spacing w:after="0"/>
+            </w:pPr>
+            <w:r>
+              <w:rPr>
+                <w:rFonts w:ascii="Calibri" w:cs="Calibri" w:eastAsia="Calibri" w:hAnsi="Calibri"/>
+                <w:sz w:val="19"/>
+                <w:szCs w:val="19"/>
+              </w:rPr>
+              <w:t xml:space="preserve">The organization's name and short name, the system name, the headings on the member and staff login pages, the public website address, the support phone number, Facebook, X and YouTube pages</w:t>
+            </w:r>
+          </w:p>
+        </w:tc>
+      </w:tr>
+      <w:tr>
+        <w:tc>
+          <w:tcPr>
+            <w:tcW w:type="dxa" w:w="4680"/>
+            <w:shd w:fill="FFFFFF" w:val="clear"/>
+            <w:tcMar>
+              <w:top w:type="dxa" w:w="100"/>
+              <w:left w:type="dxa" w:w="120"/>
+              <w:bottom w:type="dxa" w:w="100"/>
+              <w:right w:type="dxa" w:w="120"/>
+            </w:tcMar>
+          </w:tcPr>
+          <w:p>
+            <w:pPr>
+              <w:spacing w:after="0"/>
+            </w:pPr>
+            <w:r>
+              <w:rPr>
+                <w:rFonts w:ascii="Calibri" w:cs="Calibri" w:eastAsia="Calibri" w:hAnsi="Calibri"/>
+                <w:b/>
+                <w:bCs/>
+                <w:sz w:val="19"/>
+                <w:szCs w:val="19"/>
+              </w:rPr>
+              <w:t xml:space="preserve">Wording</w:t>
+            </w:r>
+          </w:p>
+        </w:tc>
+        <w:tc>
+          <w:tcPr>
+            <w:tcW w:type="dxa" w:w="4680"/>
+            <w:shd w:fill="FFFFFF" w:val="clear"/>
+            <w:tcMar>
+              <w:top w:type="dxa" w:w="100"/>
+              <w:left w:type="dxa" w:w="120"/>
+              <w:bottom w:type="dxa" w:w="100"/>
+              <w:right w:type="dxa" w:w="120"/>
+            </w:tcMar>
+          </w:tcPr>
+          <w:p>
+            <w:pPr>
+              <w:spacing w:after="0"/>
+            </w:pPr>
+            <w:r>
+              <w:rPr>
+                <w:rFonts w:ascii="Calibri" w:cs="Calibri" w:eastAsia="Calibri" w:hAnsi="Calibri"/>
+                <w:sz w:val="19"/>
+                <w:szCs w:val="19"/>
+              </w:rPr>
+              <w:t xml:space="preserve">What the system calls a member, a chapter and a staff member (singular and plural), the name of the Website menu, and what people are asked for after their password</w:t>
+            </w:r>
+          </w:p>
+        </w:tc>
+      </w:tr>
+      <w:tr>
+        <w:tc>
+          <w:tcPr>
+            <w:tcW w:type="dxa" w:w="4680"/>
+            <w:shd w:fill="F7F9FA" w:val="clear"/>
+            <w:tcMar>
+              <w:top w:type="dxa" w:w="100"/>
+              <w:left w:type="dxa" w:w="120"/>
+              <w:bottom w:type="dxa" w:w="100"/>
+              <w:right w:type="dxa" w:w="120"/>
+            </w:tcMar>
+          </w:tcPr>
+          <w:p>
+            <w:pPr>
+              <w:spacing w:after="0"/>
+            </w:pPr>
+            <w:r>
+              <w:rPr>
+                <w:rFonts w:ascii="Calibri" w:cs="Calibri" w:eastAsia="Calibri" w:hAnsi="Calibri"/>
+                <w:b/>
+                <w:bCs/>
+                <w:sz w:val="19"/>
+                <w:szCs w:val="19"/>
+              </w:rPr>
+              <w:t xml:space="preserve">Look</w:t>
+            </w:r>
+          </w:p>
+        </w:tc>
+        <w:tc>
+          <w:tcPr>
+            <w:tcW w:type="dxa" w:w="4680"/>
+            <w:shd w:fill="F7F9FA" w:val="clear"/>
+            <w:tcMar>
+              <w:top w:type="dxa" w:w="100"/>
+              <w:left w:type="dxa" w:w="120"/>
+              <w:bottom w:type="dxa" w:w="100"/>
+              <w:right w:type="dxa" w:w="120"/>
+            </w:tcMar>
+          </w:tcPr>
+          <w:p>
+            <w:pPr>
+              <w:spacing w:after="0"/>
+            </w:pPr>
+            <w:r>
+              <w:rPr>
+                <w:rFonts w:ascii="Calibri" w:cs="Calibri" w:eastAsia="Calibri" w:hAnsi="Calibri"/>
+                <w:sz w:val="19"/>
+                <w:szCs w:val="19"/>
+              </w:rPr>
+              <w:t xml:space="preserve">The color scheme, the logo and header logo, and the extra button in the member home's top menu (for example a registration link)</w:t>
+            </w:r>
+          </w:p>
+        </w:tc>
+      </w:tr>
+      <w:tr>
+        <w:tc>
+          <w:tcPr>
+            <w:tcW w:type="dxa" w:w="4680"/>
+            <w:shd w:fill="FFFFFF" w:val="clear"/>
+            <w:tcMar>
+              <w:top w:type="dxa" w:w="100"/>
+              <w:left w:type="dxa" w:w="120"/>
+              <w:bottom w:type="dxa" w:w="100"/>
+              <w:right w:type="dxa" w:w="120"/>
+            </w:tcMar>
+          </w:tcPr>
+          <w:p>
+            <w:pPr>
+              <w:spacing w:after="0"/>
+            </w:pPr>
+            <w:r>
+              <w:rPr>
+                <w:rFonts w:ascii="Calibri" w:cs="Calibri" w:eastAsia="Calibri" w:hAnsi="Calibri"/>
+                <w:b/>
+                <w:bCs/>
+                <w:sz w:val="19"/>
+                <w:szCs w:val="19"/>
+              </w:rPr>
+              <w:t xml:space="preserve">Features &amp; Policy</w:t>
+            </w:r>
+          </w:p>
+        </w:tc>
+        <w:tc>
+          <w:tcPr>
+            <w:tcW w:type="dxa" w:w="4680"/>
+            <w:shd w:fill="FFFFFF" w:val="clear"/>
+            <w:tcMar>
+              <w:top w:type="dxa" w:w="100"/>
+              <w:left w:type="dxa" w:w="120"/>
+              <w:bottom w:type="dxa" w:w="100"/>
+              <w:right w:type="dxa" w:w="120"/>
+            </w:tcMar>
+          </w:tcPr>
+          <w:p>
+            <w:pPr>
+              <w:spacing w:after="0"/>
+            </w:pPr>
+            <w:r>
+              <w:rPr>
+                <w:rFonts w:ascii="Calibri" w:cs="Calibri" w:eastAsia="Calibri" w:hAnsi="Calibri"/>
+                <w:sz w:val="19"/>
+                <w:szCs w:val="19"/>
+              </w:rPr>
+              <w:t xml:space="preserve">Whether the site's front address shows the public website, whether members may post Bulletin Board sticky notes, the minimum password length, and whether new members must change their password the first time they log in</w:t>
+            </w:r>
+          </w:p>
+        </w:tc>
+      </w:tr>
+      <w:tr>
+        <w:tc>
+          <w:tcPr>
+            <w:tcW w:type="dxa" w:w="4680"/>
+            <w:shd w:fill="F7F9FA" w:val="clear"/>
+            <w:tcMar>
+              <w:top w:type="dxa" w:w="100"/>
+              <w:left w:type="dxa" w:w="120"/>
+              <w:bottom w:type="dxa" w:w="100"/>
+              <w:right w:type="dxa" w:w="120"/>
+            </w:tcMar>
+          </w:tcPr>
+          <w:p>
+            <w:pPr>
+              <w:spacing w:after="0"/>
+            </w:pPr>
+            <w:r>
+              <w:rPr>
+                <w:rFonts w:ascii="Calibri" w:cs="Calibri" w:eastAsia="Calibri" w:hAnsi="Calibri"/>
+                <w:b/>
+                <w:bCs/>
+                <w:sz w:val="19"/>
+                <w:szCs w:val="19"/>
+              </w:rPr>
+              <w:t xml:space="preserve">DMS</w:t>
+            </w:r>
+          </w:p>
+        </w:tc>
+        <w:tc>
+          <w:tcPr>
+            <w:tcW w:type="dxa" w:w="4680"/>
+            <w:shd w:fill="F7F9FA" w:val="clear"/>
+            <w:tcMar>
+              <w:top w:type="dxa" w:w="100"/>
+              <w:left w:type="dxa" w:w="120"/>
+              <w:bottom w:type="dxa" w:w="100"/>
+              <w:right w:type="dxa" w:w="120"/>
+            </w:tcMar>
+          </w:tcPr>
+          <w:p>
+            <w:pPr>
+              <w:spacing w:after="0"/>
+            </w:pPr>
+            <w:r>
+              <w:rPr>
+                <w:rFonts w:ascii="Calibri" w:cs="Calibri" w:eastAsia="Calibri" w:hAnsi="Calibri"/>
+                <w:sz w:val="19"/>
+                <w:szCs w:val="19"/>
+              </w:rPr>
+              <w:t xml:space="preserve">Document Library labels: the organization and tag names, the Kanban column headings, which columns show, and when the editing page opens</w:t>
+            </w:r>
+          </w:p>
+        </w:tc>
+      </w:tr>
+    </w:tbl>
+    <w:p>
+      <w:pPr>
+        <w:spacing w:after="240"/>
+      </w:pPr>
+    </w:p>
+    <w:p>
+      <w:pPr>
+        <w:pStyle w:val="Heading3"/>
+        <w:spacing w:after="160" w:before="320"/>
+      </w:pPr>
+      <w:r>
+        <w:t xml:space="preserve">Color Scheme and Logos</w:t>
+      </w:r>
+    </w:p>
+    <w:p>
+      <w:pPr>
+        <w:spacing w:after="160"/>
+      </w:pPr>
+      <w:r>
+        <w:rPr>
+          <w:rFonts w:ascii="Calibri" w:cs="Calibri" w:eastAsia="Calibri" w:hAnsi="Calibri"/>
+        </w:rPr>
+        <w:t xml:space="preserve">On the </w:t>
+      </w:r>
+      <w:r>
+        <w:rPr>
+          <w:rFonts w:ascii="Calibri" w:cs="Calibri" w:eastAsia="Calibri" w:hAnsi="Calibri"/>
+          <w:b/>
+          <w:bCs/>
+        </w:rPr>
+        <w:t xml:space="preserve">Look</w:t>
+      </w:r>
+      <w:r>
+        <w:rPr>
+          <w:rFonts w:ascii="Calibri" w:cs="Calibri" w:eastAsia="Calibri" w:hAnsi="Calibri"/>
+        </w:rPr>
+        <w:t xml:space="preserve"> tab, each color scheme is a card showing its six colors. Click a card and save, and every screen changes to those colors. </w:t>
+      </w:r>
+      <w:r>
+        <w:rPr>
+          <w:rFonts w:ascii="Calibri" w:cs="Calibri" w:eastAsia="Calibri" w:hAnsi="Calibri"/>
+          <w:b/>
+          <w:bCs/>
+        </w:rPr>
+        <w:t xml:space="preserve">Classic</w:t>
+      </w:r>
+      <w:r>
+        <w:rPr>
+          <w:rFonts w:ascii="Calibri" w:cs="Calibri" w:eastAsia="Calibri" w:hAnsi="Calibri"/>
+        </w:rPr>
+        <w:t xml:space="preserve"> is the colors the site has always had. </w:t>
+      </w:r>
+      <w:r>
+        <w:rPr>
+          <w:rFonts w:ascii="Calibri" w:cs="Calibri" w:eastAsia="Calibri" w:hAnsi="Calibri"/>
+          <w:b/>
+          <w:bCs/>
+        </w:rPr>
+        <w:t xml:space="preserve">Custom</w:t>
+      </w:r>
+      <w:r>
+        <w:rPr>
+          <w:rFonts w:ascii="Calibri" w:cs="Calibri" w:eastAsia="Calibri" w:hAnsi="Calibri"/>
+        </w:rPr>
+        <w:t xml:space="preserve"> lets you choose the six colors yourself: click a color box on the Custom card to open a color picker.</w:t>
+      </w:r>
+    </w:p>
+    <w:p>
+      <w:pPr>
+        <w:spacing w:after="160"/>
+      </w:pPr>
+      <w:r>
+        <w:rPr>
+          <w:rFonts w:ascii="Calibri" w:cs="Calibri" w:eastAsia="Calibri" w:hAnsi="Calibri"/>
+        </w:rPr>
+        <w:t xml:space="preserve">The six colors, left to right: </w:t>
+      </w:r>
+      <w:r>
+        <w:rPr>
+          <w:rFonts w:ascii="Calibri" w:cs="Calibri" w:eastAsia="Calibri" w:hAnsi="Calibri"/>
+          <w:b/>
+          <w:bCs/>
+        </w:rPr>
+        <w:t xml:space="preserve">Primary</w:t>
+      </w:r>
+      <w:r>
+        <w:rPr>
+          <w:rFonts w:ascii="Calibri" w:cs="Calibri" w:eastAsia="Calibri" w:hAnsi="Calibri"/>
+        </w:rPr>
+        <w:t xml:space="preserve"> (site name, headings, member names), </w:t>
+      </w:r>
+      <w:r>
+        <w:rPr>
+          <w:rFonts w:ascii="Calibri" w:cs="Calibri" w:eastAsia="Calibri" w:hAnsi="Calibri"/>
+          <w:b/>
+          <w:bCs/>
+        </w:rPr>
+        <w:t xml:space="preserve">Accent</w:t>
+      </w:r>
+      <w:r>
+        <w:rPr>
+          <w:rFonts w:ascii="Calibri" w:cs="Calibri" w:eastAsia="Calibri" w:hAnsi="Calibri"/>
+        </w:rPr>
+        <w:t xml:space="preserve"> (record box headers), </w:t>
+      </w:r>
+      <w:r>
+        <w:rPr>
+          <w:rFonts w:ascii="Calibri" w:cs="Calibri" w:eastAsia="Calibri" w:hAnsi="Calibri"/>
+          <w:b/>
+          <w:bCs/>
+        </w:rPr>
+        <w:t xml:space="preserve">Highlight</w:t>
+      </w:r>
+      <w:r>
+        <w:rPr>
+          <w:rFonts w:ascii="Calibri" w:cs="Calibri" w:eastAsia="Calibri" w:hAnsi="Calibri"/>
+        </w:rPr>
+        <w:t xml:space="preserve"> (icons), </w:t>
+      </w:r>
+      <w:r>
+        <w:rPr>
+          <w:rFonts w:ascii="Calibri" w:cs="Calibri" w:eastAsia="Calibri" w:hAnsi="Calibri"/>
+          <w:b/>
+          <w:bCs/>
+        </w:rPr>
+        <w:t xml:space="preserve">Label</w:t>
+      </w:r>
+      <w:r>
+        <w:rPr>
+          <w:rFonts w:ascii="Calibri" w:cs="Calibri" w:eastAsia="Calibri" w:hAnsi="Calibri"/>
+        </w:rPr>
+        <w:t xml:space="preserve"> (form labels, Back buttons), </w:t>
+      </w:r>
+      <w:r>
+        <w:rPr>
+          <w:rFonts w:ascii="Calibri" w:cs="Calibri" w:eastAsia="Calibri" w:hAnsi="Calibri"/>
+          <w:b/>
+          <w:bCs/>
+        </w:rPr>
+        <w:t xml:space="preserve">Value</w:t>
+      </w:r>
+      <w:r>
+        <w:rPr>
+          <w:rFonts w:ascii="Calibri" w:cs="Calibri" w:eastAsia="Calibri" w:hAnsi="Calibri"/>
+        </w:rPr>
+        <w:t xml:space="preserve"> (the information beside labels) and </w:t>
+      </w:r>
+      <w:r>
+        <w:rPr>
+          <w:rFonts w:ascii="Calibri" w:cs="Calibri" w:eastAsia="Calibri" w:hAnsi="Calibri"/>
+          <w:b/>
+          <w:bCs/>
+        </w:rPr>
+        <w:t xml:space="preserve">Menu</w:t>
+      </w:r>
+      <w:r>
+        <w:rPr>
+          <w:rFonts w:ascii="Calibri" w:cs="Calibri" w:eastAsia="Calibri" w:hAnsi="Calibri"/>
+        </w:rPr>
+        <w:t xml:space="preserve"> (the side menu).</w:t>
+      </w:r>
+    </w:p>
+    <w:p>
+      <w:pPr>
+        <w:spacing w:after="160"/>
+      </w:pPr>
+      <w:r>
+        <w:rPr>
+          <w:rFonts w:ascii="Calibri" w:cs="Calibri" w:eastAsia="Calibri" w:hAnsi="Calibri"/>
+        </w:rPr>
+        <w:t xml:space="preserve">For a new logo, first upload the picture under </w:t>
+      </w:r>
+      <w:r>
+        <w:rPr>
+          <w:rFonts w:ascii="Calibri" w:cs="Calibri" w:eastAsia="Calibri" w:hAnsi="Calibri"/>
+          <w:b/>
+          <w:bCs/>
+        </w:rPr>
+        <w:t xml:space="preserve">Website &gt; Pictures</w:t>
+      </w:r>
+      <w:r>
+        <w:rPr>
+          <w:rFonts w:ascii="Calibri" w:cs="Calibri" w:eastAsia="Calibri" w:hAnsi="Calibri"/>
+        </w:rPr>
+        <w:t xml:space="preserve"> (about 100 x 82 pixels looks best). Then choose it as </w:t>
+      </w:r>
+      <w:r>
+        <w:rPr>
+          <w:rFonts w:ascii="Calibri" w:cs="Calibri" w:eastAsia="Calibri" w:hAnsi="Calibri"/>
+          <w:b/>
+          <w:bCs/>
+        </w:rPr>
+        <w:t xml:space="preserve">Logo</w:t>
+      </w:r>
+      <w:r>
+        <w:rPr>
+          <w:rFonts w:ascii="Calibri" w:cs="Calibri" w:eastAsia="Calibri" w:hAnsi="Calibri"/>
+        </w:rPr>
+        <w:t xml:space="preserve"> on the Look tab; a preview shows under the list. </w:t>
+      </w:r>
+      <w:r>
+        <w:rPr>
+          <w:rFonts w:ascii="Calibri" w:cs="Calibri" w:eastAsia="Calibri" w:hAnsi="Calibri"/>
+          <w:b/>
+          <w:bCs/>
+        </w:rPr>
+        <w:t xml:space="preserve">Default logo</w:t>
+      </w:r>
+      <w:r>
+        <w:rPr>
+          <w:rFonts w:ascii="Calibri" w:cs="Calibri" w:eastAsia="Calibri" w:hAnsi="Calibri"/>
+        </w:rPr>
+        <w:t xml:space="preserve"> puts the original back.</w:t>
+      </w:r>
+    </w:p>
+    <w:tbl>
+      <w:tblPr>
+        <w:tblW w:type="pct" w:w="5000"/>
+        <w:tblBorders>
+          <w:top w:val="single" w:color="5BC0DE" w:sz="4"/>
+          <w:left w:val="single" w:color="5BC0DE" w:sz="4"/>
+          <w:bottom w:val="single" w:color="5BC0DE" w:sz="4"/>
+          <w:right w:val="single" w:color="5BC0DE" w:sz="4"/>
+          <w:insideH w:val="single" w:color="auto" w:sz="4"/>
+          <w:insideV w:val="single" w:color="auto" w:sz="4"/>
+        </w:tblBorders>
+      </w:tblPr>
+      <w:tblGrid>
+        <w:gridCol w:w="9360"/>
+      </w:tblGrid>
+      <w:tr>
+        <w:tc>
+          <w:tcPr>
+            <w:tcW w:type="pct" w:w="5000"/>
+            <w:shd w:fill="D9EDF7" w:val="clear"/>
+            <w:tcMar>
+              <w:top w:type="dxa" w:w="160"/>
+              <w:left w:type="dxa" w:w="200"/>
+              <w:bottom w:type="dxa" w:w="160"/>
+              <w:right w:type="dxa" w:w="200"/>
+            </w:tcMar>
+          </w:tcPr>
+          <w:p>
+            <w:pPr>
+              <w:spacing w:after="0"/>
+            </w:pPr>
+            <w:r>
+              <w:rPr>
+                <w:rFonts w:ascii="Calibri" w:cs="Calibri" w:eastAsia="Calibri" w:hAnsi="Calibri"/>
+              </w:rPr>
+              <w:t xml:space="preserve">Try a new scheme, look around a few screens, and switch back to Classic if you don't like it. Some older screens have colors of their own and don't follow the scheme yet.</w:t>
+            </w:r>
+          </w:p>
+        </w:tc>
+      </w:tr>
+    </w:tbl>
+    <w:p>
+      <w:pPr>
+        <w:spacing w:after="200"/>
+      </w:pPr>
+    </w:p>
+    <w:p>
+      <w:pPr>
+        <w:pStyle w:val="Heading3"/>
+        <w:spacing w:after="160" w:before="320"/>
+      </w:pPr>
+      <w:r>
+        <w:t xml:space="preserve">Financial Settings</w:t>
+      </w:r>
+    </w:p>
+    <w:p>
+      <w:pPr>
+        <w:spacing w:after="160"/>
+      </w:pPr>
+      <w:r>
+        <w:rPr>
+          <w:rFonts w:ascii="Calibri" w:cs="Calibri" w:eastAsia="Calibri" w:hAnsi="Calibri"/>
+        </w:rPr>
+        <w:t xml:space="preserve">Financial Admins see only this tab. They reach it from </w:t>
+      </w:r>
+      <w:r>
+        <w:rPr>
+          <w:rFonts w:ascii="Calibri" w:cs="Calibri" w:eastAsia="Calibri" w:hAnsi="Calibri"/>
+          <w:b/>
+          <w:bCs/>
+        </w:rPr>
+        <w:t xml:space="preserve">Financial Settings</w:t>
+      </w:r>
+      <w:r>
+        <w:rPr>
+          <w:rFonts w:ascii="Calibri" w:cs="Calibri" w:eastAsia="Calibri" w:hAnsi="Calibri"/>
+        </w:rPr>
+        <w:t xml:space="preserve"> in the Admin menu (members) or the side menu (staff). System Admins find it as the first tab of System Settings.</w:t>
+      </w:r>
+    </w:p>
+    <w:tbl>
+      <w:tblPr>
+        <w:tblW w:type="dxa" w:w="9360"/>
+        <w:tblBorders>
+          <w:top w:val="single" w:color="auto" w:sz="4"/>
+          <w:left w:val="single" w:color="auto" w:sz="4"/>
+          <w:bottom w:val="single" w:color="auto" w:sz="4"/>
+          <w:right w:val="single" w:color="auto" w:sz="4"/>
+          <w:insideH w:val="single" w:color="auto" w:sz="4"/>
+          <w:insideV w:val="single" w:color="auto" w:sz="4"/>
+        </w:tblBorders>
+      </w:tblPr>
+      <w:tblGrid>
+        <w:gridCol w:w="4680"/>
+        <w:gridCol w:w="4680"/>
+      </w:tblGrid>
+      <w:tr>
+        <w:trPr>
+          <w:tblHeader/>
+        </w:trPr>
+        <w:tc>
+          <w:tcPr>
+            <w:tcW w:type="dxa" w:w="4680"/>
+            <w:shd w:fill="2C3E50" w:val="clear"/>
+            <w:tcMar>
+              <w:top w:type="dxa" w:w="100"/>
+              <w:left w:type="dxa" w:w="120"/>
+              <w:bottom w:type="dxa" w:w="100"/>
+              <w:right w:type="dxa" w:w="120"/>
+            </w:tcMar>
+          </w:tcPr>
+          <w:p>
+            <w:pPr>
+              <w:spacing w:after="0"/>
+            </w:pPr>
+            <w:r>
+              <w:rPr>
+                <w:rFonts w:ascii="Calibri" w:cs="Calibri" w:eastAsia="Calibri" w:hAnsi="Calibri"/>
+                <w:b/>
+                <w:bCs/>
+                <w:color w:val="FFFFFF"/>
+                <w:sz w:val="20"/>
+                <w:szCs w:val="20"/>
+              </w:rPr>
+              <w:t xml:space="preserve">Setting</w:t>
+            </w:r>
+          </w:p>
+        </w:tc>
+        <w:tc>
+          <w:tcPr>
+            <w:tcW w:type="dxa" w:w="4680"/>
+            <w:shd w:fill="2C3E50" w:val="clear"/>
+            <w:tcMar>
+              <w:top w:type="dxa" w:w="100"/>
+              <w:left w:type="dxa" w:w="120"/>
+              <w:bottom w:type="dxa" w:w="100"/>
+              <w:right w:type="dxa" w:w="120"/>
+            </w:tcMar>
+          </w:tcPr>
+          <w:p>
+            <w:pPr>
+              <w:spacing w:after="0"/>
+            </w:pPr>
+            <w:r>
+              <w:rPr>
+                <w:rFonts w:ascii="Calibri" w:cs="Calibri" w:eastAsia="Calibri" w:hAnsi="Calibri"/>
+                <w:b/>
+                <w:bCs/>
+                <w:color w:val="FFFFFF"/>
+                <w:sz w:val="20"/>
+                <w:szCs w:val="20"/>
+              </w:rPr>
+              <w:t xml:space="preserve">What it means</w:t>
+            </w:r>
+          </w:p>
+        </w:tc>
+      </w:tr>
+      <w:tr>
+        <w:tc>
+          <w:tcPr>
+            <w:tcW w:type="dxa" w:w="4680"/>
+            <w:shd w:fill="FFFFFF" w:val="clear"/>
+            <w:tcMar>
+              <w:top w:type="dxa" w:w="100"/>
+              <w:left w:type="dxa" w:w="120"/>
+              <w:bottom w:type="dxa" w:w="100"/>
+              <w:right w:type="dxa" w:w="120"/>
+            </w:tcMar>
+          </w:tcPr>
+          <w:p>
+            <w:pPr>
+              <w:spacing w:after="0"/>
+            </w:pPr>
+            <w:r>
+              <w:rPr>
+                <w:rFonts w:ascii="Calibri" w:cs="Calibri" w:eastAsia="Calibri" w:hAnsi="Calibri"/>
+                <w:b/>
+                <w:bCs/>
+                <w:sz w:val="19"/>
+                <w:szCs w:val="19"/>
+              </w:rPr>
+              <w:t xml:space="preserve">Current membership year</w:t>
+            </w:r>
+          </w:p>
+        </w:tc>
+        <w:tc>
+          <w:tcPr>
+            <w:tcW w:type="dxa" w:w="4680"/>
+            <w:shd w:fill="FFFFFF" w:val="clear"/>
+            <w:tcMar>
+              <w:top w:type="dxa" w:w="100"/>
+              <w:left w:type="dxa" w:w="120"/>
+              <w:bottom w:type="dxa" w:w="100"/>
+              <w:right w:type="dxa" w:w="120"/>
+            </w:tcMar>
+          </w:tcPr>
+          <w:p>
+            <w:pPr>
+              <w:spacing w:after="0"/>
+            </w:pPr>
+            <w:r>
+              <w:rPr>
+                <w:rFonts w:ascii="Calibri" w:cs="Calibri" w:eastAsia="Calibri" w:hAnsi="Calibri"/>
+                <w:sz w:val="19"/>
+                <w:szCs w:val="19"/>
+              </w:rPr>
+              <w:t xml:space="preserve">The year in force. Members last renewed for an earlier year are Past Due or Expired</w:t>
+            </w:r>
+          </w:p>
+        </w:tc>
+      </w:tr>
+      <w:tr>
+        <w:tc>
+          <w:tcPr>
+            <w:tcW w:type="dxa" w:w="4680"/>
+            <w:shd w:fill="F7F9FA" w:val="clear"/>
+            <w:tcMar>
+              <w:top w:type="dxa" w:w="100"/>
+              <w:left w:type="dxa" w:w="120"/>
+              <w:bottom w:type="dxa" w:w="100"/>
+              <w:right w:type="dxa" w:w="120"/>
+            </w:tcMar>
+          </w:tcPr>
+          <w:p>
+            <w:pPr>
+              <w:spacing w:after="0"/>
+            </w:pPr>
+            <w:r>
+              <w:rPr>
+                <w:rFonts w:ascii="Calibri" w:cs="Calibri" w:eastAsia="Calibri" w:hAnsi="Calibri"/>
+                <w:b/>
+                <w:bCs/>
+                <w:sz w:val="19"/>
+                <w:szCs w:val="19"/>
+              </w:rPr>
+              <w:t xml:space="preserve">Grace period</w:t>
+            </w:r>
+          </w:p>
+        </w:tc>
+        <w:tc>
+          <w:tcPr>
+            <w:tcW w:type="dxa" w:w="4680"/>
+            <w:shd w:fill="F7F9FA" w:val="clear"/>
+            <w:tcMar>
+              <w:top w:type="dxa" w:w="100"/>
+              <w:left w:type="dxa" w:w="120"/>
+              <w:bottom w:type="dxa" w:w="100"/>
+              <w:right w:type="dxa" w:w="120"/>
+            </w:tcMar>
+          </w:tcPr>
+          <w:p>
+            <w:pPr>
+              <w:spacing w:after="0"/>
+            </w:pPr>
+            <w:r>
+              <w:rPr>
+                <w:rFonts w:ascii="Calibri" w:cs="Calibri" w:eastAsia="Calibri" w:hAnsi="Calibri"/>
+                <w:sz w:val="19"/>
+                <w:szCs w:val="19"/>
+              </w:rPr>
+              <w:t xml:space="preserve">On: members behind on their dues show as </w:t>
+            </w:r>
+            <w:r>
+              <w:rPr>
+                <w:rFonts w:ascii="Calibri" w:cs="Calibri" w:eastAsia="Calibri" w:hAnsi="Calibri"/>
+                <w:b/>
+                <w:bCs/>
+                <w:sz w:val="19"/>
+                <w:szCs w:val="19"/>
+              </w:rPr>
+              <w:t xml:space="preserve">Past Due</w:t>
+            </w:r>
+            <w:r>
+              <w:rPr>
+                <w:rFonts w:ascii="Calibri" w:cs="Calibri" w:eastAsia="Calibri" w:hAnsi="Calibri"/>
+                <w:sz w:val="19"/>
+                <w:szCs w:val="19"/>
+              </w:rPr>
+              <w:t xml:space="preserve">. Off: they show as </w:t>
+            </w:r>
+            <w:r>
+              <w:rPr>
+                <w:rFonts w:ascii="Calibri" w:cs="Calibri" w:eastAsia="Calibri" w:hAnsi="Calibri"/>
+                <w:b/>
+                <w:bCs/>
+                <w:sz w:val="19"/>
+                <w:szCs w:val="19"/>
+              </w:rPr>
+              <w:t xml:space="preserve">Expired</w:t>
+            </w:r>
+          </w:p>
+        </w:tc>
+      </w:tr>
+      <w:tr>
+        <w:tc>
+          <w:tcPr>
+            <w:tcW w:type="dxa" w:w="4680"/>
+            <w:shd w:fill="FFFFFF" w:val="clear"/>
+            <w:tcMar>
+              <w:top w:type="dxa" w:w="100"/>
+              <w:left w:type="dxa" w:w="120"/>
+              <w:bottom w:type="dxa" w:w="100"/>
+              <w:right w:type="dxa" w:w="120"/>
+            </w:tcMar>
+          </w:tcPr>
+          <w:p>
+            <w:pPr>
+              <w:spacing w:after="0"/>
+            </w:pPr>
+            <w:r>
+              <w:rPr>
+                <w:rFonts w:ascii="Calibri" w:cs="Calibri" w:eastAsia="Calibri" w:hAnsi="Calibri"/>
+                <w:b/>
+                <w:bCs/>
+                <w:sz w:val="19"/>
+                <w:szCs w:val="19"/>
+              </w:rPr>
+              <w:t xml:space="preserve">Dues payment year</w:t>
+            </w:r>
+          </w:p>
+        </w:tc>
+        <w:tc>
+          <w:tcPr>
+            <w:tcW w:type="dxa" w:w="4680"/>
+            <w:shd w:fill="FFFFFF" w:val="clear"/>
+            <w:tcMar>
+              <w:top w:type="dxa" w:w="100"/>
+              <w:left w:type="dxa" w:w="120"/>
+              <w:bottom w:type="dxa" w:w="100"/>
+              <w:right w:type="dxa" w:w="120"/>
+            </w:tcMar>
+          </w:tcPr>
+          <w:p>
+            <w:pPr>
+              <w:spacing w:after="0"/>
+            </w:pPr>
+            <w:r>
+              <w:rPr>
+                <w:rFonts w:ascii="Calibri" w:cs="Calibri" w:eastAsia="Calibri" w:hAnsi="Calibri"/>
+                <w:sz w:val="19"/>
+                <w:szCs w:val="19"/>
+              </w:rPr>
+              <w:t xml:space="preserve">The only year members can pay dues for. Paying for more than one year goes through the Treasurer</w:t>
+            </w:r>
+          </w:p>
+        </w:tc>
+      </w:tr>
+      <w:tr>
+        <w:tc>
+          <w:tcPr>
+            <w:tcW w:type="dxa" w:w="4680"/>
+            <w:shd w:fill="F7F9FA" w:val="clear"/>
+            <w:tcMar>
+              <w:top w:type="dxa" w:w="100"/>
+              <w:left w:type="dxa" w:w="120"/>
+              <w:bottom w:type="dxa" w:w="100"/>
+              <w:right w:type="dxa" w:w="120"/>
+            </w:tcMar>
+          </w:tcPr>
+          <w:p>
+            <w:pPr>
+              <w:spacing w:after="0"/>
+            </w:pPr>
+            <w:r>
+              <w:rPr>
+                <w:rFonts w:ascii="Calibri" w:cs="Calibri" w:eastAsia="Calibri" w:hAnsi="Calibri"/>
+                <w:b/>
+                <w:bCs/>
+                <w:sz w:val="19"/>
+                <w:szCs w:val="19"/>
+              </w:rPr>
+              <w:t xml:space="preserve">New member dues proration</w:t>
+            </w:r>
+          </w:p>
+        </w:tc>
+        <w:tc>
+          <w:tcPr>
+            <w:tcW w:type="dxa" w:w="4680"/>
+            <w:shd w:fill="F7F9FA" w:val="clear"/>
+            <w:tcMar>
+              <w:top w:type="dxa" w:w="100"/>
+              <w:left w:type="dxa" w:w="120"/>
+              <w:bottom w:type="dxa" w:w="100"/>
+              <w:right w:type="dxa" w:w="120"/>
+            </w:tcMar>
+          </w:tcPr>
+          <w:p>
+            <w:pPr>
+              <w:spacing w:after="0"/>
+            </w:pPr>
+            <w:r>
+              <w:rPr>
+                <w:rFonts w:ascii="Calibri" w:cs="Calibri" w:eastAsia="Calibri" w:hAnsi="Calibri"/>
+                <w:sz w:val="19"/>
+                <w:szCs w:val="19"/>
+              </w:rPr>
+              <w:t xml:space="preserve">The share of full dues a new member pays: 1.0 = full dues, 0.75 = 25% off, 0 = free</w:t>
+            </w:r>
+          </w:p>
+        </w:tc>
+      </w:tr>
+    </w:tbl>
+    <w:p>
+      <w:pPr>
+        <w:spacing w:after="240"/>
+      </w:pPr>
+    </w:p>
+    <w:p>
+      <w:pPr>
+        <w:spacing w:after="160"/>
+      </w:pPr>
+      <w:r>
+        <w:rPr>
+          <w:rFonts w:ascii="Calibri" w:cs="Calibri" w:eastAsia="Calibri" w:hAnsi="Calibri"/>
+        </w:rPr>
+        <w:t xml:space="preserve">Changing the </w:t>
+      </w:r>
+      <w:r>
+        <w:rPr>
+          <w:rFonts w:ascii="Calibri" w:cs="Calibri" w:eastAsia="Calibri" w:hAnsi="Calibri"/>
+          <w:b/>
+          <w:bCs/>
+        </w:rPr>
+        <w:t xml:space="preserve">current membership year</w:t>
+      </w:r>
+      <w:r>
+        <w:rPr>
+          <w:rFonts w:ascii="Calibri" w:cs="Calibri" w:eastAsia="Calibri" w:hAnsi="Calibri"/>
+        </w:rPr>
+        <w:t xml:space="preserve"> or the </w:t>
+      </w:r>
+      <w:r>
+        <w:rPr>
+          <w:rFonts w:ascii="Calibri" w:cs="Calibri" w:eastAsia="Calibri" w:hAnsi="Calibri"/>
+          <w:b/>
+          <w:bCs/>
+        </w:rPr>
+        <w:t xml:space="preserve">grace period</w:t>
+      </w:r>
+      <w:r>
+        <w:rPr>
+          <w:rFonts w:ascii="Calibri" w:cs="Calibri" w:eastAsia="Calibri" w:hAnsi="Calibri"/>
+        </w:rPr>
+        <w:t xml:space="preserve"> changes members' statuses, so Honcho asks first. A page lists the changes and how many members will be re-checked; click </w:t>
+      </w:r>
+      <w:r>
+        <w:rPr>
+          <w:rFonts w:ascii="Calibri" w:cs="Calibri" w:eastAsia="Calibri" w:hAnsi="Calibri"/>
+          <w:b/>
+          <w:bCs/>
+        </w:rPr>
+        <w:t xml:space="preserve">Save and re-check</w:t>
+      </w:r>
+      <w:r>
+        <w:rPr>
+          <w:rFonts w:ascii="Calibri" w:cs="Calibri" w:eastAsia="Calibri" w:hAnsi="Calibri"/>
+        </w:rPr>
+        <w:t xml:space="preserve"> to go ahead or </w:t>
+      </w:r>
+      <w:r>
+        <w:rPr>
+          <w:rFonts w:ascii="Calibri" w:cs="Calibri" w:eastAsia="Calibri" w:hAnsi="Calibri"/>
+          <w:b/>
+          <w:bCs/>
+        </w:rPr>
+        <w:t xml:space="preserve">Cancel</w:t>
+      </w:r>
+      <w:r>
+        <w:rPr>
+          <w:rFonts w:ascii="Calibri" w:cs="Calibri" w:eastAsia="Calibri" w:hAnsi="Calibri"/>
+        </w:rPr>
+        <w:t xml:space="preserve"> to change nothing. When it's done, the message at the top says how many members' status changed.</w:t>
+      </w:r>
+    </w:p>
+    <w:p>
+      <w:pPr>
+        <w:spacing w:after="160"/>
+      </w:pPr>
+      <w:r>
+        <w:rPr>
+          <w:rFonts w:ascii="Calibri" w:cs="Calibri" w:eastAsia="Calibri" w:hAnsi="Calibri"/>
+        </w:rPr>
+        <w:t xml:space="preserve">Lifetime members (year 2099) always stay Current. To make someone a Financial Admin, tick </w:t>
+      </w:r>
+      <w:r>
+        <w:rPr>
+          <w:rFonts w:ascii="Calibri" w:cs="Calibri" w:eastAsia="Calibri" w:hAnsi="Calibri"/>
+          <w:b/>
+          <w:bCs/>
+        </w:rPr>
+        <w:t xml:space="preserve">Financial Admin</w:t>
+      </w:r>
+      <w:r>
+        <w:rPr>
+          <w:rFonts w:ascii="Calibri" w:cs="Calibri" w:eastAsia="Calibri" w:hAnsi="Calibri"/>
+        </w:rPr>
+        <w:t xml:space="preserve"> on their member record, or in Member Permissions.</w:t>
       </w:r>
     </w:p>
     <w:p>

</xml_diff>

<commit_message>
Member cards phase 1: the card in the portal and the phone app
- card_helper.php: one active card per member; QR code HC1:<id>:<HMAC>
  keyed by CARD_SECRET (or derived from JWT_SECRET), card_lookup() rejects
  made-up or tampered codes, reissue cancels the old one
- welcome-cards: My Card page (side menu tile), admin view of a member's
  card (Card button on the member record; Chapter Admins own chapter),
  cancel and reissue (POST, token, Auditlog)
- Phone app: Card tab (welcome-api/mycard, reissuecard), works offline
  with the last card loaded, cleared at sign-out; shell cache v17
- qrcode-generator 1.4.4 (MIT, npm checksum checked) in public/js
- Migration 2026-10-26-member-cards.sql; docs: Developer's Guide CCMPS >
  Member Cards, helpdocs, Users' Guide, .env.example, CLAUDE.md, to-do

Co-Authored-By: Claude Opus 5.5 <noreply@anthropic.com>
</commit_message>
<xml_diff>
--- a/docs/users-guide/Honcho_Users_Guide.docx
+++ b/docs/users-guide/Honcho_Users_Guide.docx
@@ -45,7 +45,7 @@
           <w:sz w:val="20"/>
           <w:szCs w:val="20"/>
         </w:rPr>
-        <w:t xml:space="preserve">Generated 2026-10-25</w:t>
+        <w:t xml:space="preserve">Generated 2026-10-26</w:t>
       </w:r>
     </w:p>
     <w:p>
@@ -3950,6 +3950,187 @@
         <w:spacing w:after="240" w:before="500"/>
       </w:pPr>
       <w:r>
+        <w:t xml:space="preserve">Your Membership Card</w:t>
+      </w:r>
+    </w:p>
+    <w:p>
+      <w:pPr>
+        <w:spacing w:after="160"/>
+      </w:pPr>
+      <w:r>
+        <w:rPr>
+          <w:rFonts w:ascii="Calibri" w:cs="Calibri" w:eastAsia="Calibri" w:hAnsi="Calibri"/>
+        </w:rPr>
+        <w:t xml:space="preserve">Click </w:t>
+      </w:r>
+      <w:r>
+        <w:rPr>
+          <w:rFonts w:ascii="Calibri" w:cs="Calibri" w:eastAsia="Calibri" w:hAnsi="Calibri"/>
+          <w:b/>
+          <w:bCs/>
+        </w:rPr>
+        <w:t xml:space="preserve">My Card</w:t>
+      </w:r>
+      <w:r>
+        <w:rPr>
+          <w:rFonts w:ascii="Calibri" w:cs="Calibri" w:eastAsia="Calibri" w:hAnsi="Calibri"/>
+        </w:rPr>
+        <w:t xml:space="preserve"> in the side menu (or the </w:t>
+      </w:r>
+      <w:r>
+        <w:rPr>
+          <w:rFonts w:ascii="Calibri" w:cs="Calibri" w:eastAsia="Calibri" w:hAnsi="Calibri"/>
+          <w:b/>
+          <w:bCs/>
+        </w:rPr>
+        <w:t xml:space="preserve">Card</w:t>
+      </w:r>
+      <w:r>
+        <w:rPr>
+          <w:rFonts w:ascii="Calibri" w:cs="Calibri" w:eastAsia="Calibri" w:hAnsi="Calibri"/>
+        </w:rPr>
+        <w:t xml:space="preserve"> tab in the phone app) to see your digital membership card: your name, member number, chapter, member type, the year your membership runs to, and a QR code.</w:t>
+      </w:r>
+    </w:p>
+    <w:p>
+      <w:pPr>
+        <w:spacing w:after="160"/>
+      </w:pPr>
+      <w:r>
+        <w:rPr>
+          <w:rFonts w:ascii="Calibri" w:cs="Calibri" w:eastAsia="Calibri" w:hAnsi="Calibri"/>
+        </w:rPr>
+        <w:t xml:space="preserve">Show the QR code at the door of BPA events and meetings. A volunteer scans it and the system checks, at that moment, that your membership is current. The code contains no personal information.</w:t>
+      </w:r>
+    </w:p>
+    <w:p>
+      <w:pPr>
+        <w:spacing w:after="160"/>
+      </w:pPr>
+      <w:r>
+        <w:rPr>
+          <w:rFonts w:ascii="Calibri" w:cs="Calibri" w:eastAsia="Calibri" w:hAnsi="Calibri"/>
+        </w:rPr>
+        <w:t xml:space="preserve">In the phone app the card also opens without signal, as long as you've opened it once before with signal.</w:t>
+      </w:r>
+    </w:p>
+    <w:p>
+      <w:pPr>
+        <w:pStyle w:val="Heading3"/>
+        <w:spacing w:after="160" w:before="320"/>
+      </w:pPr>
+      <w:r>
+        <w:t xml:space="preserve">Lost Your Phone?</w:t>
+      </w:r>
+    </w:p>
+    <w:p>
+      <w:pPr>
+        <w:spacing w:after="160"/>
+      </w:pPr>
+      <w:r>
+        <w:rPr>
+          <w:rFonts w:ascii="Calibri" w:cs="Calibri" w:eastAsia="Calibri" w:hAnsi="Calibri"/>
+        </w:rPr>
+        <w:t xml:space="preserve">Open My Card on another device, tick </w:t>
+      </w:r>
+      <w:r>
+        <w:rPr>
+          <w:rFonts w:ascii="Calibri" w:cs="Calibri" w:eastAsia="Calibri" w:hAnsi="Calibri"/>
+          <w:b/>
+          <w:bCs/>
+        </w:rPr>
+        <w:t xml:space="preserve">I understand the old card stops working</w:t>
+      </w:r>
+      <w:r>
+        <w:rPr>
+          <w:rFonts w:ascii="Calibri" w:cs="Calibri" w:eastAsia="Calibri" w:hAnsi="Calibri"/>
+        </w:rPr>
+        <w:t xml:space="preserve"> and click </w:t>
+      </w:r>
+      <w:r>
+        <w:rPr>
+          <w:rFonts w:ascii="Calibri" w:cs="Calibri" w:eastAsia="Calibri" w:hAnsi="Calibri"/>
+          <w:b/>
+          <w:bCs/>
+        </w:rPr>
+        <w:t xml:space="preserve">Cancel and issue a new card</w:t>
+      </w:r>
+      <w:r>
+        <w:rPr>
+          <w:rFonts w:ascii="Calibri" w:cs="Calibri" w:eastAsia="Calibri" w:hAnsi="Calibri"/>
+        </w:rPr>
+        <w:t xml:space="preserve">. The QR code on the lost phone stops working at once. Your Chapter Admin or a Member Admin can do this for you too.</w:t>
+      </w:r>
+    </w:p>
+    <w:tbl>
+      <w:tblPr>
+        <w:tblW w:type="pct" w:w="5000"/>
+        <w:tblBorders>
+          <w:top w:val="single" w:color="5BC0DE" w:sz="4"/>
+          <w:left w:val="single" w:color="5BC0DE" w:sz="4"/>
+          <w:bottom w:val="single" w:color="5BC0DE" w:sz="4"/>
+          <w:right w:val="single" w:color="5BC0DE" w:sz="4"/>
+          <w:insideH w:val="single" w:color="auto" w:sz="4"/>
+          <w:insideV w:val="single" w:color="auto" w:sz="4"/>
+        </w:tblBorders>
+      </w:tblPr>
+      <w:tblGrid>
+        <w:gridCol w:w="9360"/>
+      </w:tblGrid>
+      <w:tr>
+        <w:tc>
+          <w:tcPr>
+            <w:tcW w:type="pct" w:w="5000"/>
+            <w:shd w:fill="D9EDF7" w:val="clear"/>
+            <w:tcMar>
+              <w:top w:type="dxa" w:w="160"/>
+              <w:left w:type="dxa" w:w="200"/>
+              <w:bottom w:type="dxa" w:w="160"/>
+              <w:right w:type="dxa" w:w="200"/>
+            </w:tcMar>
+          </w:tcPr>
+          <w:p>
+            <w:pPr>
+              <w:spacing w:after="0"/>
+            </w:pPr>
+            <w:r>
+              <w:rPr>
+                <w:rFonts w:ascii="Calibri" w:cs="Calibri" w:eastAsia="Calibri" w:hAnsi="Calibri"/>
+              </w:rPr>
+              <w:t xml:space="preserve">Coming soon: </w:t>
+            </w:r>
+            <w:r>
+              <w:rPr>
+                <w:rFonts w:ascii="Calibri" w:cs="Calibri" w:eastAsia="Calibri" w:hAnsi="Calibri"/>
+                <w:b/>
+                <w:bCs/>
+              </w:rPr>
+              <w:t xml:space="preserve">Add to Google Wallet</w:t>
+            </w:r>
+            <w:r>
+              <w:rPr>
+                <w:rFonts w:ascii="Calibri" w:cs="Calibri" w:eastAsia="Calibri" w:hAnsi="Calibri"/>
+              </w:rPr>
+              <w:t xml:space="preserve">, so the card sits in your phone's wallet. Apple Wallet will follow.</w:t>
+            </w:r>
+          </w:p>
+        </w:tc>
+      </w:tr>
+    </w:tbl>
+    <w:p>
+      <w:pPr>
+        <w:spacing w:after="200"/>
+      </w:pPr>
+    </w:p>
+    <w:p>
+      <w:pPr>
+        <w:pStyle w:val="Heading2"/>
+        <w:pBdr>
+          <w:bottom w:val="single" w:color="2C3E50" w:sz="6" w:space="8"/>
+        </w:pBdr>
+        <w:spacing w:after="240" w:before="500"/>
+      </w:pPr>
+      <w:r>
         <w:t xml:space="preserve">Membership Status</w:t>
       </w:r>
     </w:p>
@@ -8496,6 +8677,54 @@
           <w:rFonts w:ascii="Calibri" w:cs="Calibri" w:eastAsia="Calibri" w:hAnsi="Calibri"/>
         </w:rPr>
         <w:t xml:space="preserve"> as their Current Year and save. Lifetime members are always Current, whatever the dues year.</w:t>
+      </w:r>
+    </w:p>
+    <w:p>
+      <w:pPr>
+        <w:pStyle w:val="Heading3"/>
+        <w:spacing w:after="160" w:before="320"/>
+      </w:pPr>
+      <w:r>
+        <w:t xml:space="preserve">Membership Cards</w:t>
+      </w:r>
+    </w:p>
+    <w:p>
+      <w:pPr>
+        <w:spacing w:after="160"/>
+      </w:pPr>
+      <w:r>
+        <w:rPr>
+          <w:rFonts w:ascii="Calibri" w:cs="Calibri" w:eastAsia="Calibri" w:hAnsi="Calibri"/>
+        </w:rPr>
+        <w:t xml:space="preserve">The </w:t>
+      </w:r>
+      <w:r>
+        <w:rPr>
+          <w:rFonts w:ascii="Calibri" w:cs="Calibri" w:eastAsia="Calibri" w:hAnsi="Calibri"/>
+          <w:b/>
+          <w:bCs/>
+        </w:rPr>
+        <w:t xml:space="preserve">Card</w:t>
+      </w:r>
+      <w:r>
+        <w:rPr>
+          <w:rFonts w:ascii="Calibri" w:cs="Calibri" w:eastAsia="Calibri" w:hAnsi="Calibri"/>
+        </w:rPr>
+        <w:t xml:space="preserve"> button on a member's record shows their digital membership card. If they've lost their phone, </w:t>
+      </w:r>
+      <w:r>
+        <w:rPr>
+          <w:rFonts w:ascii="Calibri" w:cs="Calibri" w:eastAsia="Calibri" w:hAnsi="Calibri"/>
+          <w:b/>
+          <w:bCs/>
+        </w:rPr>
+        <w:t xml:space="preserve">Cancel and issue a new card</w:t>
+      </w:r>
+      <w:r>
+        <w:rPr>
+          <w:rFonts w:ascii="Calibri" w:cs="Calibri" w:eastAsia="Calibri" w:hAnsi="Calibri"/>
+        </w:rPr>
+        <w:t xml:space="preserve"> stops the old QR code working at once. Chapter Admins can do this for their own chapter's members.</w:t>
       </w:r>
     </w:p>
     <w:p>

</xml_diff>

<commit_message>
Docs: system admin accounts (staff sysadmin at /honcho, member portaladmin for Honcho Lite), slider picture crop
Co-Authored-By: Claude Opus 5.5 <noreply@anthropic.com>
</commit_message>
<xml_diff>
--- a/docs/users-guide/Honcho_Users_Guide.docx
+++ b/docs/users-guide/Honcho_Users_Guide.docx
@@ -45,7 +45,7 @@
           <w:sz w:val="20"/>
           <w:szCs w:val="20"/>
         </w:rPr>
-        <w:t xml:space="preserve">Generated 2026-10-26</w:t>
+        <w:t xml:space="preserve">Generated 2026-10-27</w:t>
       </w:r>
     </w:p>
     <w:p>
@@ -3405,7 +3405,7 @@
                 <w:sz w:val="19"/>
                 <w:szCs w:val="19"/>
               </w:rPr>
-              <w:t xml:space="preserve">Pilot Certificate &amp; Ratings</w:t>
+              <w:t xml:space="preserve">Certificates &amp; Ratings</w:t>
             </w:r>
           </w:p>
         </w:tc>
@@ -3804,6 +3804,68 @@
           <w:rFonts w:ascii="Calibri" w:cs="Calibri" w:eastAsia="Calibri" w:hAnsi="Calibri"/>
         </w:rPr>
         <w:t xml:space="preserve"> section each aircraft has its own row. Change a row to edit it, fill in a blank row to add one, or tick its delete box to remove it, then save.</w:t>
+      </w:r>
+    </w:p>
+    <w:p>
+      <w:pPr>
+        <w:pStyle w:val="Heading3"/>
+        <w:spacing w:after="160" w:before="320"/>
+      </w:pPr>
+      <w:r>
+        <w:t xml:space="preserve">Text Size</w:t>
+      </w:r>
+    </w:p>
+    <w:p>
+      <w:pPr>
+        <w:spacing w:after="160"/>
+      </w:pPr>
+      <w:r>
+        <w:rPr>
+          <w:rFonts w:ascii="Calibri" w:cs="Calibri" w:eastAsia="Calibri" w:hAnsi="Calibri"/>
+        </w:rPr>
+        <w:t xml:space="preserve">Click </w:t>
+      </w:r>
+      <w:r>
+        <w:rPr>
+          <w:rFonts w:ascii="Calibri" w:cs="Calibri" w:eastAsia="Calibri" w:hAnsi="Calibri"/>
+          <w:b/>
+          <w:bCs/>
+        </w:rPr>
+        <w:t xml:space="preserve">Font</w:t>
+      </w:r>
+      <w:r>
+        <w:rPr>
+          <w:rFonts w:ascii="Calibri" w:cs="Calibri" w:eastAsia="Calibri" w:hAnsi="Calibri"/>
+        </w:rPr>
+        <w:t xml:space="preserve"> in the top bar (next to Change Password) to choose how large text appears for you: tabs, headings, labels, values and buttons, each Small, Medium or Large. Click </w:t>
+      </w:r>
+      <w:r>
+        <w:rPr>
+          <w:rFonts w:ascii="Calibri" w:cs="Calibri" w:eastAsia="Calibri" w:hAnsi="Calibri"/>
+          <w:b/>
+          <w:bCs/>
+        </w:rPr>
+        <w:t xml:space="preserve">Save</w:t>
+      </w:r>
+      <w:r>
+        <w:rPr>
+          <w:rFonts w:ascii="Calibri" w:cs="Calibri" w:eastAsia="Calibri" w:hAnsi="Calibri"/>
+        </w:rPr>
+        <w:t xml:space="preserve"> and the page reloads with the new sizes. The same choices are under </w:t>
+      </w:r>
+      <w:r>
+        <w:rPr>
+          <w:rFonts w:ascii="Calibri" w:cs="Calibri" w:eastAsia="Calibri" w:hAnsi="Calibri"/>
+          <w:b/>
+          <w:bCs/>
+        </w:rPr>
+        <w:t xml:space="preserve">Preferences</w:t>
+      </w:r>
+      <w:r>
+        <w:rPr>
+          <w:rFonts w:ascii="Calibri" w:cs="Calibri" w:eastAsia="Calibri" w:hAnsi="Calibri"/>
+        </w:rPr>
+        <w:t xml:space="preserve"> on your profile.</w:t>
       </w:r>
     </w:p>
     <w:p>
@@ -13638,7 +13700,21 @@
               <w:rPr>
                 <w:rFonts w:ascii="Calibri" w:cs="Calibri" w:eastAsia="Calibri" w:hAnsi="Calibri"/>
               </w:rPr>
-              <w:t xml:space="preserve"> menu. Projects is part of the staff portal, so it isn't in the member menu.</w:t>
+              <w:t xml:space="preserve"> menu, for members with the System Admin role; an installation can have a dedicated account for this that isn't a person (BPA's is </w:t>
+            </w:r>
+            <w:r>
+              <w:rPr>
+                <w:rFonts w:ascii="Calibri" w:cs="Calibri" w:eastAsia="Calibri" w:hAnsi="Calibri"/>
+                <w:b/>
+                <w:bCs/>
+              </w:rPr>
+              <w:t xml:space="preserve">portaladmin</w:t>
+            </w:r>
+            <w:r>
+              <w:rPr>
+                <w:rFonts w:ascii="Calibri" w:cs="Calibri" w:eastAsia="Calibri" w:hAnsi="Calibri"/>
+              </w:rPr>
+              <w:t xml:space="preserve">). Staff accounts always sign in at the staff login, not the member portal. Projects is part of the staff portal, so it isn't in the member menu.</w:t>
             </w:r>
           </w:p>
         </w:tc>
@@ -14276,7 +14352,7 @@
                 <w:sz w:val="19"/>
                 <w:szCs w:val="19"/>
               </w:rPr>
-              <w:t xml:space="preserve">Look</w:t>
+              <w:t xml:space="preserve">Member Fields</w:t>
             </w:r>
           </w:p>
         </w:tc>
@@ -14301,7 +14377,7 @@
                 <w:sz w:val="19"/>
                 <w:szCs w:val="19"/>
               </w:rPr>
-              <w:t xml:space="preserve">The color scheme, the logo and header logo, and the extra button in the member home's top menu (for example a registration link)</w:t>
+              <w:t xml:space="preserve">Show or hide some fields of the member record (Department, Reports To and Lead Source so far). A hidden field disappears from the profile and the edit form; anything already stored in it is kept</w:t>
             </w:r>
           </w:p>
         </w:tc>
@@ -14330,7 +14406,7 @@
                 <w:sz w:val="19"/>
                 <w:szCs w:val="19"/>
               </w:rPr>
-              <w:t xml:space="preserve">Features &amp; Policy</w:t>
+              <w:t xml:space="preserve">Look</w:t>
             </w:r>
           </w:p>
         </w:tc>
@@ -14355,7 +14431,7 @@
                 <w:sz w:val="19"/>
                 <w:szCs w:val="19"/>
               </w:rPr>
-              <w:t xml:space="preserve">Whether the site's front address shows the public website, whether members may post Bulletin Board sticky notes, the minimum password length, and whether new members must change their password the first time they log in</w:t>
+              <w:t xml:space="preserve">The color scheme, the logo and header logo, and the extra button in the member home's top menu (for example a registration link)</w:t>
             </w:r>
           </w:p>
         </w:tc>
@@ -14384,6 +14460,60 @@
                 <w:sz w:val="19"/>
                 <w:szCs w:val="19"/>
               </w:rPr>
+              <w:t xml:space="preserve">Features &amp; Policy</w:t>
+            </w:r>
+          </w:p>
+        </w:tc>
+        <w:tc>
+          <w:tcPr>
+            <w:tcW w:type="dxa" w:w="4680"/>
+            <w:shd w:fill="F7F9FA" w:val="clear"/>
+            <w:tcMar>
+              <w:top w:type="dxa" w:w="100"/>
+              <w:left w:type="dxa" w:w="120"/>
+              <w:bottom w:type="dxa" w:w="100"/>
+              <w:right w:type="dxa" w:w="120"/>
+            </w:tcMar>
+          </w:tcPr>
+          <w:p>
+            <w:pPr>
+              <w:spacing w:after="0"/>
+            </w:pPr>
+            <w:r>
+              <w:rPr>
+                <w:rFonts w:ascii="Calibri" w:cs="Calibri" w:eastAsia="Calibri" w:hAnsi="Calibri"/>
+                <w:sz w:val="19"/>
+                <w:szCs w:val="19"/>
+              </w:rPr>
+              <w:t xml:space="preserve">Whether the site's front address shows the public website, whether members may post Bulletin Board sticky notes, the minimum password length, and whether new members must change their password the first time they log in</w:t>
+            </w:r>
+          </w:p>
+        </w:tc>
+      </w:tr>
+      <w:tr>
+        <w:tc>
+          <w:tcPr>
+            <w:tcW w:type="dxa" w:w="4680"/>
+            <w:shd w:fill="FFFFFF" w:val="clear"/>
+            <w:tcMar>
+              <w:top w:type="dxa" w:w="100"/>
+              <w:left w:type="dxa" w:w="120"/>
+              <w:bottom w:type="dxa" w:w="100"/>
+              <w:right w:type="dxa" w:w="120"/>
+            </w:tcMar>
+          </w:tcPr>
+          <w:p>
+            <w:pPr>
+              <w:spacing w:after="0"/>
+            </w:pPr>
+            <w:r>
+              <w:rPr>
+                <w:rFonts w:ascii="Calibri" w:cs="Calibri" w:eastAsia="Calibri" w:hAnsi="Calibri"/>
+                <w:b/>
+                <w:bCs/>
+                <w:sz w:val="19"/>
+                <w:szCs w:val="19"/>
+              </w:rPr>
               <w:t xml:space="preserve">DMS</w:t>
             </w:r>
           </w:p>
@@ -14391,7 +14521,7 @@
         <w:tc>
           <w:tcPr>
             <w:tcW w:type="dxa" w:w="4680"/>
-            <w:shd w:fill="F7F9FA" w:val="clear"/>
+            <w:shd w:fill="FFFFFF" w:val="clear"/>
             <w:tcMar>
               <w:top w:type="dxa" w:w="100"/>
               <w:left w:type="dxa" w:w="120"/>

</xml_diff>

<commit_message>
Admin side menu: Expand/Hide Menu renamed Expand/Hide (Users' Guide too)
Co-Authored-By: Claude Opus 5.5 <noreply@anthropic.com>
</commit_message>
<xml_diff>
--- a/docs/users-guide/Honcho_Users_Guide.docx
+++ b/docs/users-guide/Honcho_Users_Guide.docx
@@ -45,7 +45,7 @@
           <w:sz w:val="20"/>
           <w:szCs w:val="20"/>
         </w:rPr>
-        <w:t xml:space="preserve">Generated 2026-10-27</w:t>
+        <w:t xml:space="preserve">Generated 2026-10-28</w:t>
       </w:r>
     </w:p>
     <w:p>
@@ -2514,7 +2514,7 @@
           <w:b/>
           <w:bCs/>
         </w:rPr>
-        <w:t xml:space="preserve">Expand/Hide Menu</w:t>
+        <w:t xml:space="preserve">Expand/Hide</w:t>
       </w:r>
       <w:r>
         <w:rPr>

</xml_diff>

<commit_message>
Member side menu: Admin item renamed EMS (the short system name setting); Users' Guide
Co-Authored-By: Claude Opus 5.5 <noreply@anthropic.com>
</commit_message>
<xml_diff>
--- a/docs/users-guide/Honcho_Users_Guide.docx
+++ b/docs/users-guide/Honcho_Users_Guide.docx
@@ -2399,7 +2399,7 @@
                 <w:sz w:val="19"/>
                 <w:szCs w:val="19"/>
               </w:rPr>
-              <w:t xml:space="preserve">Admin</w:t>
+              <w:t xml:space="preserve">EMS</w:t>
             </w:r>
           </w:p>
         </w:tc>
@@ -2424,7 +2424,7 @@
                 <w:sz w:val="19"/>
                 <w:szCs w:val="19"/>
               </w:rPr>
-              <w:t xml:space="preserve">Admin pages, shown only if you have an admin role</w:t>
+              <w:t xml:space="preserve">Admin pages, shown only if you have an admin role (the name is set on System Settings &gt; Organization)</w:t>
             </w:r>
           </w:p>
         </w:tc>
@@ -5312,21 +5312,21 @@
         <w:rPr>
           <w:rFonts w:ascii="Calibri" w:cs="Calibri" w:eastAsia="Calibri" w:hAnsi="Calibri"/>
         </w:rPr>
-        <w:t xml:space="preserve"> section, and the home page's </w:t>
-      </w:r>
-      <w:r>
-        <w:rPr>
-          <w:rFonts w:ascii="Calibri" w:cs="Calibri" w:eastAsia="Calibri" w:hAnsi="Calibri"/>
-          <w:b/>
-          <w:bCs/>
-        </w:rPr>
-        <w:t xml:space="preserve">Admin</w:t>
-      </w:r>
-      <w:r>
-        <w:rPr>
-          <w:rFonts w:ascii="Calibri" w:cs="Calibri" w:eastAsia="Calibri" w:hAnsi="Calibri"/>
-        </w:rPr>
-        <w:t xml:space="preserve"> tile shows </w:t>
+        <w:t xml:space="preserve"> section, and the side menu's </w:t>
+      </w:r>
+      <w:r>
+        <w:rPr>
+          <w:rFonts w:ascii="Calibri" w:cs="Calibri" w:eastAsia="Calibri" w:hAnsi="Calibri"/>
+          <w:b/>
+          <w:bCs/>
+        </w:rPr>
+        <w:t xml:space="preserve">EMS</w:t>
+      </w:r>
+      <w:r>
+        <w:rPr>
+          <w:rFonts w:ascii="Calibri" w:cs="Calibri" w:eastAsia="Calibri" w:hAnsi="Calibri"/>
+        </w:rPr>
+        <w:t xml:space="preserve"> item shows </w:t>
       </w:r>
       <w:r>
         <w:rPr>

</xml_diff>

<commit_message>
Users' Guide: picture sizes for the slider (1920 x 640, framing tips)
Co-Authored-By: Claude Opus 5.5 <noreply@anthropic.com>
</commit_message>
<xml_diff>
--- a/docs/users-guide/Honcho_Users_Guide.docx
+++ b/docs/users-guide/Honcho_Users_Guide.docx
@@ -10889,6 +10889,503 @@
           <w:rFonts w:ascii="Calibri" w:cs="Calibri" w:eastAsia="Calibri" w:hAnsi="Calibri"/>
         </w:rPr>
         <w:t xml:space="preserve">Each picture shows how many times it's used. A picture can only be deleted when nothing uses it.</w:t>
+      </w:r>
+    </w:p>
+    <w:p>
+      <w:pPr>
+        <w:spacing w:after="120"/>
+      </w:pPr>
+    </w:p>
+    <w:p>
+      <w:pPr>
+        <w:pStyle w:val="Heading3"/>
+        <w:spacing w:after="160" w:before="320"/>
+      </w:pPr>
+      <w:r>
+        <w:t xml:space="preserve">Pictures for the Slider</w:t>
+      </w:r>
+    </w:p>
+    <w:p>
+      <w:pPr>
+        <w:spacing w:after="160"/>
+      </w:pPr>
+      <w:r>
+        <w:rPr>
+          <w:rFonts w:ascii="Calibri" w:cs="Calibri" w:eastAsia="Calibri" w:hAnsi="Calibri"/>
+        </w:rPr>
+        <w:t xml:space="preserve">The slider on the member home and the public website is always </w:t>
+      </w:r>
+      <w:r>
+        <w:rPr>
+          <w:rFonts w:ascii="Calibri" w:cs="Calibri" w:eastAsia="Calibri" w:hAnsi="Calibri"/>
+          <w:b/>
+          <w:bCs/>
+        </w:rPr>
+        <w:t xml:space="preserve">470 pixels tall</w:t>
+      </w:r>
+      <w:r>
+        <w:rPr>
+          <w:rFonts w:ascii="Calibri" w:cs="Calibri" w:eastAsia="Calibri" w:hAnsi="Calibri"/>
+        </w:rPr>
+        <w:t xml:space="preserve">; its width follows the screen, so the picture is cropped to fit:</w:t>
+      </w:r>
+    </w:p>
+    <w:tbl>
+      <w:tblPr>
+        <w:tblW w:type="dxa" w:w="9360"/>
+        <w:tblBorders>
+          <w:top w:val="single" w:color="auto" w:sz="4"/>
+          <w:left w:val="single" w:color="auto" w:sz="4"/>
+          <w:bottom w:val="single" w:color="auto" w:sz="4"/>
+          <w:right w:val="single" w:color="auto" w:sz="4"/>
+          <w:insideH w:val="single" w:color="auto" w:sz="4"/>
+          <w:insideV w:val="single" w:color="auto" w:sz="4"/>
+        </w:tblBorders>
+      </w:tblPr>
+      <w:tblGrid>
+        <w:gridCol w:w="3120"/>
+        <w:gridCol w:w="3120"/>
+        <w:gridCol w:w="3120"/>
+      </w:tblGrid>
+      <w:tr>
+        <w:trPr>
+          <w:tblHeader/>
+        </w:trPr>
+        <w:tc>
+          <w:tcPr>
+            <w:tcW w:type="dxa" w:w="3120"/>
+            <w:shd w:fill="2C3E50" w:val="clear"/>
+            <w:tcMar>
+              <w:top w:type="dxa" w:w="100"/>
+              <w:left w:type="dxa" w:w="120"/>
+              <w:bottom w:type="dxa" w:w="100"/>
+              <w:right w:type="dxa" w:w="120"/>
+            </w:tcMar>
+          </w:tcPr>
+          <w:p>
+            <w:pPr>
+              <w:spacing w:after="0"/>
+            </w:pPr>
+            <w:r>
+              <w:rPr>
+                <w:rFonts w:ascii="Calibri" w:cs="Calibri" w:eastAsia="Calibri" w:hAnsi="Calibri"/>
+                <w:b/>
+                <w:bCs/>
+                <w:color w:val="FFFFFF"/>
+                <w:sz w:val="20"/>
+                <w:szCs w:val="20"/>
+              </w:rPr>
+              <w:t xml:space="preserve">Screen width</w:t>
+            </w:r>
+          </w:p>
+        </w:tc>
+        <w:tc>
+          <w:tcPr>
+            <w:tcW w:type="dxa" w:w="3120"/>
+            <w:shd w:fill="2C3E50" w:val="clear"/>
+            <w:tcMar>
+              <w:top w:type="dxa" w:w="100"/>
+              <w:left w:type="dxa" w:w="120"/>
+              <w:bottom w:type="dxa" w:w="100"/>
+              <w:right w:type="dxa" w:w="120"/>
+            </w:tcMar>
+          </w:tcPr>
+          <w:p>
+            <w:pPr>
+              <w:spacing w:after="0"/>
+            </w:pPr>
+            <w:r>
+              <w:rPr>
+                <w:rFonts w:ascii="Calibri" w:cs="Calibri" w:eastAsia="Calibri" w:hAnsi="Calibri"/>
+                <w:b/>
+                <w:bCs/>
+                <w:color w:val="FFFFFF"/>
+                <w:sz w:val="20"/>
+                <w:szCs w:val="20"/>
+              </w:rPr>
+              <w:t xml:space="preserve">Slide size</w:t>
+            </w:r>
+          </w:p>
+        </w:tc>
+        <w:tc>
+          <w:tcPr>
+            <w:tcW w:type="dxa" w:w="3120"/>
+            <w:shd w:fill="2C3E50" w:val="clear"/>
+            <w:tcMar>
+              <w:top w:type="dxa" w:w="100"/>
+              <w:left w:type="dxa" w:w="120"/>
+              <w:bottom w:type="dxa" w:w="100"/>
+              <w:right w:type="dxa" w:w="120"/>
+            </w:tcMar>
+          </w:tcPr>
+          <w:p>
+            <w:pPr>
+              <w:spacing w:after="0"/>
+            </w:pPr>
+            <w:r>
+              <w:rPr>
+                <w:rFonts w:ascii="Calibri" w:cs="Calibri" w:eastAsia="Calibri" w:hAnsi="Calibri"/>
+                <w:b/>
+                <w:bCs/>
+                <w:color w:val="FFFFFF"/>
+                <w:sz w:val="20"/>
+                <w:szCs w:val="20"/>
+              </w:rPr>
+              <w:t xml:space="preserve">Shape (width : height)</w:t>
+            </w:r>
+          </w:p>
+        </w:tc>
+      </w:tr>
+      <w:tr>
+        <w:tc>
+          <w:tcPr>
+            <w:tcW w:type="dxa" w:w="3120"/>
+            <w:shd w:fill="FFFFFF" w:val="clear"/>
+            <w:tcMar>
+              <w:top w:type="dxa" w:w="100"/>
+              <w:left w:type="dxa" w:w="120"/>
+              <w:bottom w:type="dxa" w:w="100"/>
+              <w:right w:type="dxa" w:w="120"/>
+            </w:tcMar>
+          </w:tcPr>
+          <w:p>
+            <w:pPr>
+              <w:spacing w:after="0"/>
+            </w:pPr>
+            <w:r>
+              <w:rPr>
+                <w:rFonts w:ascii="Calibri" w:cs="Calibri" w:eastAsia="Calibri" w:hAnsi="Calibri"/>
+                <w:sz w:val="19"/>
+                <w:szCs w:val="19"/>
+              </w:rPr>
+              <w:t xml:space="preserve">1280</w:t>
+            </w:r>
+          </w:p>
+        </w:tc>
+        <w:tc>
+          <w:tcPr>
+            <w:tcW w:type="dxa" w:w="3120"/>
+            <w:shd w:fill="FFFFFF" w:val="clear"/>
+            <w:tcMar>
+              <w:top w:type="dxa" w:w="100"/>
+              <w:left w:type="dxa" w:w="120"/>
+              <w:bottom w:type="dxa" w:w="100"/>
+              <w:right w:type="dxa" w:w="120"/>
+            </w:tcMar>
+          </w:tcPr>
+          <w:p>
+            <w:pPr>
+              <w:spacing w:after="0"/>
+            </w:pPr>
+            <w:r>
+              <w:rPr>
+                <w:rFonts w:ascii="Calibri" w:cs="Calibri" w:eastAsia="Calibri" w:hAnsi="Calibri"/>
+                <w:sz w:val="19"/>
+                <w:szCs w:val="19"/>
+              </w:rPr>
+              <w:t xml:space="preserve">about 990 x 470</w:t>
+            </w:r>
+          </w:p>
+        </w:tc>
+        <w:tc>
+          <w:tcPr>
+            <w:tcW w:type="dxa" w:w="3120"/>
+            <w:shd w:fill="FFFFFF" w:val="clear"/>
+            <w:tcMar>
+              <w:top w:type="dxa" w:w="100"/>
+              <w:left w:type="dxa" w:w="120"/>
+              <w:bottom w:type="dxa" w:w="100"/>
+              <w:right w:type="dxa" w:w="120"/>
+            </w:tcMar>
+          </w:tcPr>
+          <w:p>
+            <w:pPr>
+              <w:spacing w:after="0"/>
+            </w:pPr>
+            <w:r>
+              <w:rPr>
+                <w:rFonts w:ascii="Calibri" w:cs="Calibri" w:eastAsia="Calibri" w:hAnsi="Calibri"/>
+                <w:sz w:val="19"/>
+                <w:szCs w:val="19"/>
+              </w:rPr>
+              <w:t xml:space="preserve">2.1 : 1</w:t>
+            </w:r>
+          </w:p>
+        </w:tc>
+      </w:tr>
+      <w:tr>
+        <w:tc>
+          <w:tcPr>
+            <w:tcW w:type="dxa" w:w="3120"/>
+            <w:shd w:fill="F7F9FA" w:val="clear"/>
+            <w:tcMar>
+              <w:top w:type="dxa" w:w="100"/>
+              <w:left w:type="dxa" w:w="120"/>
+              <w:bottom w:type="dxa" w:w="100"/>
+              <w:right w:type="dxa" w:w="120"/>
+            </w:tcMar>
+          </w:tcPr>
+          <w:p>
+            <w:pPr>
+              <w:spacing w:after="0"/>
+            </w:pPr>
+            <w:r>
+              <w:rPr>
+                <w:rFonts w:ascii="Calibri" w:cs="Calibri" w:eastAsia="Calibri" w:hAnsi="Calibri"/>
+                <w:sz w:val="19"/>
+                <w:szCs w:val="19"/>
+              </w:rPr>
+              <w:t xml:space="preserve">1440</w:t>
+            </w:r>
+          </w:p>
+        </w:tc>
+        <w:tc>
+          <w:tcPr>
+            <w:tcW w:type="dxa" w:w="3120"/>
+            <w:shd w:fill="F7F9FA" w:val="clear"/>
+            <w:tcMar>
+              <w:top w:type="dxa" w:w="100"/>
+              <w:left w:type="dxa" w:w="120"/>
+              <w:bottom w:type="dxa" w:w="100"/>
+              <w:right w:type="dxa" w:w="120"/>
+            </w:tcMar>
+          </w:tcPr>
+          <w:p>
+            <w:pPr>
+              <w:spacing w:after="0"/>
+            </w:pPr>
+            <w:r>
+              <w:rPr>
+                <w:rFonts w:ascii="Calibri" w:cs="Calibri" w:eastAsia="Calibri" w:hAnsi="Calibri"/>
+                <w:sz w:val="19"/>
+                <w:szCs w:val="19"/>
+              </w:rPr>
+              <w:t xml:space="preserve">about 1150 x 470</w:t>
+            </w:r>
+          </w:p>
+        </w:tc>
+        <w:tc>
+          <w:tcPr>
+            <w:tcW w:type="dxa" w:w="3120"/>
+            <w:shd w:fill="F7F9FA" w:val="clear"/>
+            <w:tcMar>
+              <w:top w:type="dxa" w:w="100"/>
+              <w:left w:type="dxa" w:w="120"/>
+              <w:bottom w:type="dxa" w:w="100"/>
+              <w:right w:type="dxa" w:w="120"/>
+            </w:tcMar>
+          </w:tcPr>
+          <w:p>
+            <w:pPr>
+              <w:spacing w:after="0"/>
+            </w:pPr>
+            <w:r>
+              <w:rPr>
+                <w:rFonts w:ascii="Calibri" w:cs="Calibri" w:eastAsia="Calibri" w:hAnsi="Calibri"/>
+                <w:sz w:val="19"/>
+                <w:szCs w:val="19"/>
+              </w:rPr>
+              <w:t xml:space="preserve">2.4 : 1</w:t>
+            </w:r>
+          </w:p>
+        </w:tc>
+      </w:tr>
+      <w:tr>
+        <w:tc>
+          <w:tcPr>
+            <w:tcW w:type="dxa" w:w="3120"/>
+            <w:shd w:fill="FFFFFF" w:val="clear"/>
+            <w:tcMar>
+              <w:top w:type="dxa" w:w="100"/>
+              <w:left w:type="dxa" w:w="120"/>
+              <w:bottom w:type="dxa" w:w="100"/>
+              <w:right w:type="dxa" w:w="120"/>
+            </w:tcMar>
+          </w:tcPr>
+          <w:p>
+            <w:pPr>
+              <w:spacing w:after="0"/>
+            </w:pPr>
+            <w:r>
+              <w:rPr>
+                <w:rFonts w:ascii="Calibri" w:cs="Calibri" w:eastAsia="Calibri" w:hAnsi="Calibri"/>
+                <w:sz w:val="19"/>
+                <w:szCs w:val="19"/>
+              </w:rPr>
+              <w:t xml:space="preserve">1920</w:t>
+            </w:r>
+          </w:p>
+        </w:tc>
+        <w:tc>
+          <w:tcPr>
+            <w:tcW w:type="dxa" w:w="3120"/>
+            <w:shd w:fill="FFFFFF" w:val="clear"/>
+            <w:tcMar>
+              <w:top w:type="dxa" w:w="100"/>
+              <w:left w:type="dxa" w:w="120"/>
+              <w:bottom w:type="dxa" w:w="100"/>
+              <w:right w:type="dxa" w:w="120"/>
+            </w:tcMar>
+          </w:tcPr>
+          <w:p>
+            <w:pPr>
+              <w:spacing w:after="0"/>
+            </w:pPr>
+            <w:r>
+              <w:rPr>
+                <w:rFonts w:ascii="Calibri" w:cs="Calibri" w:eastAsia="Calibri" w:hAnsi="Calibri"/>
+                <w:sz w:val="19"/>
+                <w:szCs w:val="19"/>
+              </w:rPr>
+              <w:t xml:space="preserve">about 1630 x 470</w:t>
+            </w:r>
+          </w:p>
+        </w:tc>
+        <w:tc>
+          <w:tcPr>
+            <w:tcW w:type="dxa" w:w="3120"/>
+            <w:shd w:fill="FFFFFF" w:val="clear"/>
+            <w:tcMar>
+              <w:top w:type="dxa" w:w="100"/>
+              <w:left w:type="dxa" w:w="120"/>
+              <w:bottom w:type="dxa" w:w="100"/>
+              <w:right w:type="dxa" w:w="120"/>
+            </w:tcMar>
+          </w:tcPr>
+          <w:p>
+            <w:pPr>
+              <w:spacing w:after="0"/>
+            </w:pPr>
+            <w:r>
+              <w:rPr>
+                <w:rFonts w:ascii="Calibri" w:cs="Calibri" w:eastAsia="Calibri" w:hAnsi="Calibri"/>
+                <w:sz w:val="19"/>
+                <w:szCs w:val="19"/>
+              </w:rPr>
+              <w:t xml:space="preserve">3.5 : 1</w:t>
+            </w:r>
+          </w:p>
+        </w:tc>
+      </w:tr>
+    </w:tbl>
+    <w:p>
+      <w:pPr>
+        <w:spacing w:after="240"/>
+      </w:pPr>
+    </w:p>
+    <w:p>
+      <w:pPr>
+        <w:spacing w:after="160"/>
+      </w:pPr>
+      <w:r>
+        <w:rPr>
+          <w:rFonts w:ascii="Calibri" w:cs="Calibri" w:eastAsia="Calibri" w:hAnsi="Calibri"/>
+          <w:b/>
+          <w:bCs/>
+        </w:rPr>
+        <w:t xml:space="preserve">Best size: 1920 x 640 pixels</w:t>
+      </w:r>
+      <w:r>
+        <w:rPr>
+          <w:rFonts w:ascii="Calibri" w:cs="Calibri" w:eastAsia="Calibri" w:hAnsi="Calibri"/>
+        </w:rPr>
+        <w:t xml:space="preserve"> (3 : 1), a JPEG under about 400 KB. Uploads wider than 1920 pixels are made 1920 wide automatically, so a larger picture gains nothing.</w:t>
+      </w:r>
+    </w:p>
+    <w:p>
+      <w:pPr>
+        <w:pStyle w:val="ListParagraph"/>
+        <w:numPr>
+          <w:ilvl w:val="0"/>
+          <w:numId w:val="3"/>
+        </w:numPr>
+        <w:spacing w:after="100"/>
+      </w:pPr>
+      <w:r>
+        <w:rPr>
+          <w:rFonts w:ascii="Calibri" w:cs="Calibri" w:eastAsia="Calibri" w:hAnsi="Calibri"/>
+          <w:b/>
+          <w:bCs/>
+        </w:rPr>
+        <w:t xml:space="preserve">Keep people and key details in the middle</w:t>
+      </w:r>
+      <w:r>
+        <w:rPr>
+          <w:rFonts w:ascii="Calibri" w:cs="Calibri" w:eastAsia="Calibri" w:hAnsi="Calibri"/>
+        </w:rPr>
+        <w:t xml:space="preserve">, roughly the middle 60% of the width: the sides are cut off on narrower screens.</w:t>
+      </w:r>
+    </w:p>
+    <w:p>
+      <w:pPr>
+        <w:pStyle w:val="ListParagraph"/>
+        <w:numPr>
+          <w:ilvl w:val="0"/>
+          <w:numId w:val="3"/>
+        </w:numPr>
+        <w:spacing w:after="100"/>
+      </w:pPr>
+      <w:r>
+        <w:rPr>
+          <w:rFonts w:ascii="Calibri" w:cs="Calibri" w:eastAsia="Calibri" w:hAnsi="Calibri"/>
+          <w:b/>
+          <w:bCs/>
+        </w:rPr>
+        <w:t xml:space="preserve">Leave the left third fairly plain.</w:t>
+      </w:r>
+      <w:r>
+        <w:rPr>
+          <w:rFonts w:ascii="Calibri" w:cs="Calibri" w:eastAsia="Calibri" w:hAnsi="Calibri"/>
+        </w:rPr>
+        <w:t xml:space="preserve"> The slide's headline, text and button sit over it.</w:t>
+      </w:r>
+    </w:p>
+    <w:p>
+      <w:pPr>
+        <w:pStyle w:val="ListParagraph"/>
+        <w:numPr>
+          <w:ilvl w:val="0"/>
+          <w:numId w:val="3"/>
+        </w:numPr>
+        <w:spacing w:after="100"/>
+      </w:pPr>
+      <w:r>
+        <w:rPr>
+          <w:rFonts w:ascii="Calibri" w:cs="Calibri" w:eastAsia="Calibri" w:hAnsi="Calibri"/>
+          <w:b/>
+          <w:bCs/>
+        </w:rPr>
+        <w:t xml:space="preserve">Give heads room at the top.</w:t>
+      </w:r>
+      <w:r>
+        <w:rPr>
+          <w:rFonts w:ascii="Calibri" w:cs="Calibri" w:eastAsia="Calibri" w:hAnsi="Calibri"/>
+        </w:rPr>
+        <w:t xml:space="preserve"> The slider keeps the upper part of a picture, but a tall picture still loses some of its top and bottom.</w:t>
+      </w:r>
+    </w:p>
+    <w:p>
+      <w:pPr>
+        <w:pStyle w:val="ListParagraph"/>
+        <w:numPr>
+          <w:ilvl w:val="0"/>
+          <w:numId w:val="3"/>
+        </w:numPr>
+        <w:spacing w:after="100"/>
+      </w:pPr>
+      <w:r>
+        <w:rPr>
+          <w:rFonts w:ascii="Calibri" w:cs="Calibri" w:eastAsia="Calibri" w:hAnsi="Calibri"/>
+          <w:b/>
+          <w:bCs/>
+        </w:rPr>
+        <w:t xml:space="preserve">Avoid portrait and square pictures.</w:t>
+      </w:r>
+      <w:r>
+        <w:rPr>
+          <w:rFonts w:ascii="Calibri" w:cs="Calibri" w:eastAsia="Calibri" w:hAnsi="Calibri"/>
+        </w:rPr>
+        <w:t xml:space="preserve"> A 4 : 3 photo (for example 1024 x 768) is cropped heavily and looks soft stretched across a wide screen.</w:t>
       </w:r>
     </w:p>
     <w:p>

</xml_diff>

<commit_message>
Library: back button says Home (house icon) from the member home, Dashboard from the EMS menu
Co-Authored-By: Claude Opus 5.5 <noreply@anthropic.com>
</commit_message>
<xml_diff>
--- a/docs/users-guide/Honcho_Users_Guide.docx
+++ b/docs/users-guide/Honcho_Users_Guide.docx
@@ -11437,7 +11437,35 @@
         <w:rPr>
           <w:rFonts w:ascii="Calibri" w:cs="Calibri" w:eastAsia="Calibri" w:hAnsi="Calibri"/>
         </w:rPr>
-        <w:t xml:space="preserve"> tile or menu item.</w:t>
+        <w:t xml:space="preserve"> tile or menu item. The button at the top takes you back: </w:t>
+      </w:r>
+      <w:r>
+        <w:rPr>
+          <w:rFonts w:ascii="Calibri" w:cs="Calibri" w:eastAsia="Calibri" w:hAnsi="Calibri"/>
+          <w:b/>
+          <w:bCs/>
+        </w:rPr>
+        <w:t xml:space="preserve">Home</w:t>
+      </w:r>
+      <w:r>
+        <w:rPr>
+          <w:rFonts w:ascii="Calibri" w:cs="Calibri" w:eastAsia="Calibri" w:hAnsi="Calibri"/>
+        </w:rPr>
+        <w:t xml:space="preserve"> when you came from the member home, </w:t>
+      </w:r>
+      <w:r>
+        <w:rPr>
+          <w:rFonts w:ascii="Calibri" w:cs="Calibri" w:eastAsia="Calibri" w:hAnsi="Calibri"/>
+          <w:b/>
+          <w:bCs/>
+        </w:rPr>
+        <w:t xml:space="preserve">Dashboard</w:t>
+      </w:r>
+      <w:r>
+        <w:rPr>
+          <w:rFonts w:ascii="Calibri" w:cs="Calibri" w:eastAsia="Calibri" w:hAnsi="Calibri"/>
+        </w:rPr>
+        <w:t xml:space="preserve"> when you came from the EMS (admin) menu.</w:t>
       </w:r>
     </w:p>
     <w:p>

</xml_diff>

<commit_message>
Honcho AI phase 1: Daily Coffee Report per scope (National, chapters)
- coffee_helper.php: section collectors in plain code (membership, events, posts, documents,
  weather via wttr.in, news via Google News RSS, YouTube channel feeds), AI write-up through
  the scope's connection with the Python brief's rules, plain fallback, Brevo email
  (WHATENV=dev sends to DEVEMAIL only), schedule check
- ai/coffee, coffeesettings (sections, order, options, days, time, time zone, recipients,
  tone), Preview, Send me a test, Sent archive with each run's collected data,
  ai/coffeecron/<COFFEE_CRON_KEY> for the server's scheduler
- Migration 2026-10-29-coffee-report-phase1.sql: coffee_reports, coffee_runs
- Menus: Coffee Report under System Admin, Chapter Admin and the staff System Admin
- Docs: Developer's Guide (Coffee Report tab), Users' Guide, CLAUDE.md, to-do, .env.example

Co-Authored-By: Claude Opus 5.5 <noreply@anthropic.com>
</commit_message>
<xml_diff>
--- a/docs/users-guide/Honcho_Users_Guide.docx
+++ b/docs/users-guide/Honcho_Users_Guide.docx
@@ -5750,6 +5750,60 @@
                 <w:sz w:val="19"/>
                 <w:szCs w:val="19"/>
               </w:rPr>
+              <w:t xml:space="preserve">Coffee Report</w:t>
+            </w:r>
+          </w:p>
+        </w:tc>
+        <w:tc>
+          <w:tcPr>
+            <w:tcW w:type="dxa" w:w="4680"/>
+            <w:shd w:fill="F7F9FA" w:val="clear"/>
+            <w:tcMar>
+              <w:top w:type="dxa" w:w="100"/>
+              <w:left w:type="dxa" w:w="120"/>
+              <w:bottom w:type="dxa" w:w="100"/>
+              <w:right w:type="dxa" w:w="120"/>
+            </w:tcMar>
+          </w:tcPr>
+          <w:p>
+            <w:pPr>
+              <w:spacing w:after="0"/>
+            </w:pPr>
+            <w:r>
+              <w:rPr>
+                <w:rFonts w:ascii="Calibri" w:cs="Calibri" w:eastAsia="Calibri" w:hAnsi="Calibri"/>
+                <w:sz w:val="19"/>
+                <w:szCs w:val="19"/>
+              </w:rPr>
+              <w:t xml:space="preserve">When the AI module is switched on: your chapter's own daily email for its Chapter Admins: your chapter's membership numbers, events, posts and documents, plus weather, news and YouTube sections you choose. Preview, Send me a test, and a list of what was sent</w:t>
+            </w:r>
+          </w:p>
+        </w:tc>
+      </w:tr>
+      <w:tr>
+        <w:tc>
+          <w:tcPr>
+            <w:tcW w:type="dxa" w:w="4680"/>
+            <w:shd w:fill="FFFFFF" w:val="clear"/>
+            <w:tcMar>
+              <w:top w:type="dxa" w:w="100"/>
+              <w:left w:type="dxa" w:w="120"/>
+              <w:bottom w:type="dxa" w:w="100"/>
+              <w:right w:type="dxa" w:w="120"/>
+            </w:tcMar>
+          </w:tcPr>
+          <w:p>
+            <w:pPr>
+              <w:spacing w:after="0"/>
+            </w:pPr>
+            <w:r>
+              <w:rPr>
+                <w:rFonts w:ascii="Calibri" w:cs="Calibri" w:eastAsia="Calibri" w:hAnsi="Calibri"/>
+                <w:b/>
+                <w:bCs/>
+                <w:sz w:val="19"/>
+                <w:szCs w:val="19"/>
+              </w:rPr>
               <w:t xml:space="preserve">Chapter AI</w:t>
             </w:r>
           </w:p>
@@ -5757,7 +5811,7 @@
         <w:tc>
           <w:tcPr>
             <w:tcW w:type="dxa" w:w="4680"/>
-            <w:shd w:fill="F7F9FA" w:val="clear"/>
+            <w:shd w:fill="FFFFFF" w:val="clear"/>
             <w:tcMar>
               <w:top w:type="dxa" w:w="100"/>
               <w:left w:type="dxa" w:w="120"/>
@@ -13956,7 +14010,7 @@
                 <w:sz w:val="19"/>
                 <w:szCs w:val="19"/>
               </w:rPr>
-              <w:t xml:space="preserve">AI Connections</w:t>
+              <w:t xml:space="preserve">Coffee Report</w:t>
             </w:r>
           </w:p>
         </w:tc>
@@ -13981,43 +14035,61 @@
                 <w:sz w:val="19"/>
                 <w:szCs w:val="19"/>
               </w:rPr>
-              <w:t xml:space="preserve">When the AI module is switched on: National's AI provider account (API key, model, on/off, monthly limit), a </w:t>
-            </w:r>
-            <w:r>
-              <w:rPr>
-                <w:rFonts w:ascii="Calibri" w:cs="Calibri" w:eastAsia="Calibri" w:hAnsi="Calibri"/>
-                <w:b/>
-                <w:bCs/>
-                <w:sz w:val="19"/>
-                <w:szCs w:val="19"/>
-              </w:rPr>
-              <w:t xml:space="preserve">Test connection</w:t>
-            </w:r>
-            <w:r>
-              <w:rPr>
-                <w:rFonts w:ascii="Calibri" w:cs="Calibri" w:eastAsia="Calibri" w:hAnsi="Calibri"/>
-                <w:sz w:val="19"/>
-                <w:szCs w:val="19"/>
-              </w:rPr>
-              <w:t xml:space="preserve"> button, which chapters have their own, and </w:t>
-            </w:r>
-            <w:r>
-              <w:rPr>
-                <w:rFonts w:ascii="Calibri" w:cs="Calibri" w:eastAsia="Calibri" w:hAnsi="Calibri"/>
-                <w:b/>
-                <w:bCs/>
-                <w:sz w:val="19"/>
-                <w:szCs w:val="19"/>
-              </w:rPr>
-              <w:t xml:space="preserve">Usage</w:t>
-            </w:r>
-            <w:r>
-              <w:rPr>
-                <w:rFonts w:ascii="Calibri" w:cs="Calibri" w:eastAsia="Calibri" w:hAnsi="Calibri"/>
-                <w:sz w:val="19"/>
-                <w:szCs w:val="19"/>
-              </w:rPr>
-              <w:t xml:space="preserve"> (requests and estimated cost by month). The key is stored encrypted and never shown again. A Claude or ChatGPT *subscription* can't be entered here; it takes an API key from the provider's console</w:t>
+              <w:t xml:space="preserve">When the AI module is switched on: a short daily email for National's admins with membership numbers, upcoming events, Sunshine and Bulletin Board posts, documents waiting for approval, and weather, news and YouTube sections you choose. Pick the days, time, recipients and tone; </w:t>
+            </w:r>
+            <w:r>
+              <w:rPr>
+                <w:rFonts w:ascii="Calibri" w:cs="Calibri" w:eastAsia="Calibri" w:hAnsi="Calibri"/>
+                <w:b/>
+                <w:bCs/>
+                <w:sz w:val="19"/>
+                <w:szCs w:val="19"/>
+              </w:rPr>
+              <w:t xml:space="preserve">Preview</w:t>
+            </w:r>
+            <w:r>
+              <w:rPr>
+                <w:rFonts w:ascii="Calibri" w:cs="Calibri" w:eastAsia="Calibri" w:hAnsi="Calibri"/>
+                <w:sz w:val="19"/>
+                <w:szCs w:val="19"/>
+              </w:rPr>
+              <w:t xml:space="preserve"> shows today's report without sending, </w:t>
+            </w:r>
+            <w:r>
+              <w:rPr>
+                <w:rFonts w:ascii="Calibri" w:cs="Calibri" w:eastAsia="Calibri" w:hAnsi="Calibri"/>
+                <w:b/>
+                <w:bCs/>
+                <w:sz w:val="19"/>
+                <w:szCs w:val="19"/>
+              </w:rPr>
+              <w:t xml:space="preserve">Send me a test</w:t>
+            </w:r>
+            <w:r>
+              <w:rPr>
+                <w:rFonts w:ascii="Calibri" w:cs="Calibri" w:eastAsia="Calibri" w:hAnsi="Calibri"/>
+                <w:sz w:val="19"/>
+                <w:szCs w:val="19"/>
+              </w:rPr>
+              <w:t xml:space="preserve"> emails it to you, and </w:t>
+            </w:r>
+            <w:r>
+              <w:rPr>
+                <w:rFonts w:ascii="Calibri" w:cs="Calibri" w:eastAsia="Calibri" w:hAnsi="Calibri"/>
+                <w:b/>
+                <w:bCs/>
+                <w:sz w:val="19"/>
+                <w:szCs w:val="19"/>
+              </w:rPr>
+              <w:t xml:space="preserve">Sent</w:t>
+            </w:r>
+            <w:r>
+              <w:rPr>
+                <w:rFonts w:ascii="Calibri" w:cs="Calibri" w:eastAsia="Calibri" w:hAnsi="Calibri"/>
+                <w:sz w:val="19"/>
+                <w:szCs w:val="19"/>
+              </w:rPr>
+              <w:t xml:space="preserve"> lists every report sent with the facts it was written from. With an AI connection the AI writes it up; without one the plain facts are sent</w:t>
             </w:r>
           </w:p>
         </w:tc>
@@ -14046,7 +14118,7 @@
                 <w:sz w:val="19"/>
                 <w:szCs w:val="19"/>
               </w:rPr>
-              <w:t xml:space="preserve">Auditlog</w:t>
+              <w:t xml:space="preserve">AI Connections</w:t>
             </w:r>
           </w:p>
         </w:tc>
@@ -14071,7 +14143,43 @@
                 <w:sz w:val="19"/>
                 <w:szCs w:val="19"/>
               </w:rPr>
-              <w:t xml:space="preserve">A record of who did what and when: logins, changes, approvals and deletions. Only on installs without the staff portal (see below)</w:t>
+              <w:t xml:space="preserve">When the AI module is switched on: National's AI provider account (API key, model, on/off, monthly limit), a </w:t>
+            </w:r>
+            <w:r>
+              <w:rPr>
+                <w:rFonts w:ascii="Calibri" w:cs="Calibri" w:eastAsia="Calibri" w:hAnsi="Calibri"/>
+                <w:b/>
+                <w:bCs/>
+                <w:sz w:val="19"/>
+                <w:szCs w:val="19"/>
+              </w:rPr>
+              <w:t xml:space="preserve">Test connection</w:t>
+            </w:r>
+            <w:r>
+              <w:rPr>
+                <w:rFonts w:ascii="Calibri" w:cs="Calibri" w:eastAsia="Calibri" w:hAnsi="Calibri"/>
+                <w:sz w:val="19"/>
+                <w:szCs w:val="19"/>
+              </w:rPr>
+              <w:t xml:space="preserve"> button, which chapters have their own, and </w:t>
+            </w:r>
+            <w:r>
+              <w:rPr>
+                <w:rFonts w:ascii="Calibri" w:cs="Calibri" w:eastAsia="Calibri" w:hAnsi="Calibri"/>
+                <w:b/>
+                <w:bCs/>
+                <w:sz w:val="19"/>
+                <w:szCs w:val="19"/>
+              </w:rPr>
+              <w:t xml:space="preserve">Usage</w:t>
+            </w:r>
+            <w:r>
+              <w:rPr>
+                <w:rFonts w:ascii="Calibri" w:cs="Calibri" w:eastAsia="Calibri" w:hAnsi="Calibri"/>
+                <w:sz w:val="19"/>
+                <w:szCs w:val="19"/>
+              </w:rPr>
+              <w:t xml:space="preserve"> (requests and estimated cost by month). The key is stored encrypted and never shown again. A Claude or ChatGPT *subscription* can't be entered here; it takes an API key from the provider's console</w:t>
             </w:r>
           </w:p>
         </w:tc>
@@ -14100,7 +14208,7 @@
                 <w:sz w:val="19"/>
                 <w:szCs w:val="19"/>
               </w:rPr>
-              <w:t xml:space="preserve">Security Groups</w:t>
+              <w:t xml:space="preserve">Auditlog</w:t>
             </w:r>
           </w:p>
         </w:tc>
@@ -14125,7 +14233,7 @@
                 <w:sz w:val="19"/>
                 <w:szCs w:val="19"/>
               </w:rPr>
-              <w:t xml:space="preserve">Groups of people and the functions each group may use. Only on installs without the staff portal (see below)</w:t>
+              <w:t xml:space="preserve">A record of who did what and when: logins, changes, approvals and deletions. Only on installs without the staff portal (see below)</w:t>
             </w:r>
           </w:p>
         </w:tc>
@@ -14154,7 +14262,7 @@
                 <w:sz w:val="19"/>
                 <w:szCs w:val="19"/>
               </w:rPr>
-              <w:t xml:space="preserve">CCMPS Scopes</w:t>
+              <w:t xml:space="preserve">Security Groups</w:t>
             </w:r>
           </w:p>
         </w:tc>
@@ -14179,7 +14287,7 @@
                 <w:sz w:val="19"/>
                 <w:szCs w:val="19"/>
               </w:rPr>
-              <w:t xml:space="preserve">The "who can see it" choices for posts</w:t>
+              <w:t xml:space="preserve">Groups of people and the functions each group may use. Only on installs without the staff portal (see below)</w:t>
             </w:r>
           </w:p>
         </w:tc>
@@ -14208,7 +14316,7 @@
                 <w:sz w:val="19"/>
                 <w:szCs w:val="19"/>
               </w:rPr>
-              <w:t xml:space="preserve">Developer Guide</w:t>
+              <w:t xml:space="preserve">CCMPS Scopes</w:t>
             </w:r>
           </w:p>
         </w:tc>
@@ -14233,7 +14341,7 @@
                 <w:sz w:val="19"/>
                 <w:szCs w:val="19"/>
               </w:rPr>
-              <w:t xml:space="preserve">Technical documentation for whoever maintains Honcho</w:t>
+              <w:t xml:space="preserve">The "who can see it" choices for posts</w:t>
             </w:r>
           </w:p>
         </w:tc>
@@ -14262,6 +14370,60 @@
                 <w:sz w:val="19"/>
                 <w:szCs w:val="19"/>
               </w:rPr>
+              <w:t xml:space="preserve">Developer Guide</w:t>
+            </w:r>
+          </w:p>
+        </w:tc>
+        <w:tc>
+          <w:tcPr>
+            <w:tcW w:type="dxa" w:w="4680"/>
+            <w:shd w:fill="F7F9FA" w:val="clear"/>
+            <w:tcMar>
+              <w:top w:type="dxa" w:w="100"/>
+              <w:left w:type="dxa" w:w="120"/>
+              <w:bottom w:type="dxa" w:w="100"/>
+              <w:right w:type="dxa" w:w="120"/>
+            </w:tcMar>
+          </w:tcPr>
+          <w:p>
+            <w:pPr>
+              <w:spacing w:after="0"/>
+            </w:pPr>
+            <w:r>
+              <w:rPr>
+                <w:rFonts w:ascii="Calibri" w:cs="Calibri" w:eastAsia="Calibri" w:hAnsi="Calibri"/>
+                <w:sz w:val="19"/>
+                <w:szCs w:val="19"/>
+              </w:rPr>
+              <w:t xml:space="preserve">Technical documentation for whoever maintains Honcho</w:t>
+            </w:r>
+          </w:p>
+        </w:tc>
+      </w:tr>
+      <w:tr>
+        <w:tc>
+          <w:tcPr>
+            <w:tcW w:type="dxa" w:w="4680"/>
+            <w:shd w:fill="FFFFFF" w:val="clear"/>
+            <w:tcMar>
+              <w:top w:type="dxa" w:w="100"/>
+              <w:left w:type="dxa" w:w="120"/>
+              <w:bottom w:type="dxa" w:w="100"/>
+              <w:right w:type="dxa" w:w="120"/>
+            </w:tcMar>
+          </w:tcPr>
+          <w:p>
+            <w:pPr>
+              <w:spacing w:after="0"/>
+            </w:pPr>
+            <w:r>
+              <w:rPr>
+                <w:rFonts w:ascii="Calibri" w:cs="Calibri" w:eastAsia="Calibri" w:hAnsi="Calibri"/>
+                <w:b/>
+                <w:bCs/>
+                <w:sz w:val="19"/>
+                <w:szCs w:val="19"/>
+              </w:rPr>
               <w:t xml:space="preserve">Master Spreadsheet</w:t>
             </w:r>
           </w:p>
@@ -14269,7 +14431,7 @@
         <w:tc>
           <w:tcPr>
             <w:tcW w:type="dxa" w:w="4680"/>
-            <w:shd w:fill="F7F9FA" w:val="clear"/>
+            <w:shd w:fill="FFFFFF" w:val="clear"/>
             <w:tcMar>
               <w:top w:type="dxa" w:w="100"/>
               <w:left w:type="dxa" w:w="120"/>

</xml_diff>

<commit_message>
Coffee Report: Telegram delivery per scope (encrypted bot token, chat ID, Find chat ID, Telegram test), sent independently of email
Co-Authored-By: Claude Opus 5.5 <noreply@anthropic.com>
</commit_message>
<xml_diff>
--- a/docs/users-guide/Honcho_Users_Guide.docx
+++ b/docs/users-guide/Honcho_Users_Guide.docx
@@ -5775,7 +5775,7 @@
                 <w:sz w:val="19"/>
                 <w:szCs w:val="19"/>
               </w:rPr>
-              <w:t xml:space="preserve">When the AI module is switched on: your chapter's own daily email for its Chapter Admins: your chapter's membership numbers, events, posts and documents, plus weather, news and YouTube sections you choose. Preview, Send me a test, and a list of what was sent</w:t>
+              <w:t xml:space="preserve">When the AI module is switched on: your chapter's own daily email for its Chapter Admins: your chapter's membership numbers, events, posts and documents, plus weather, news and YouTube sections you choose, by email and optionally to a Telegram chat. Preview, Send me a test, Telegram test, and a list of what was sent</w:t>
             </w:r>
           </w:p>
         </w:tc>
@@ -14035,7 +14035,25 @@
                 <w:sz w:val="19"/>
                 <w:szCs w:val="19"/>
               </w:rPr>
-              <w:t xml:space="preserve">When the AI module is switched on: a short daily email for National's admins with membership numbers, upcoming events, Sunshine and Bulletin Board posts, documents waiting for approval, and weather, news and YouTube sections you choose. Pick the days, time, recipients and tone; </w:t>
+              <w:t xml:space="preserve">When the AI module is switched on: a short daily email for National's admins with membership numbers, upcoming events, Sunshine and Bulletin Board posts, documents waiting for approval, and weather, news and YouTube sections you choose. Pick the days, time, recipients and tone, and optionally a Telegram chat to send it to as well (make a bot with @BotFather, paste its token, message the bot, then use </w:t>
+            </w:r>
+            <w:r>
+              <w:rPr>
+                <w:rFonts w:ascii="Calibri" w:cs="Calibri" w:eastAsia="Calibri" w:hAnsi="Calibri"/>
+                <w:b/>
+                <w:bCs/>
+                <w:sz w:val="19"/>
+                <w:szCs w:val="19"/>
+              </w:rPr>
+              <w:t xml:space="preserve">Find chat ID</w:t>
+            </w:r>
+            <w:r>
+              <w:rPr>
+                <w:rFonts w:ascii="Calibri" w:cs="Calibri" w:eastAsia="Calibri" w:hAnsi="Calibri"/>
+                <w:sz w:val="19"/>
+                <w:szCs w:val="19"/>
+              </w:rPr>
+              <w:t xml:space="preserve">); </w:t>
             </w:r>
             <w:r>
               <w:rPr>

</xml_diff>